<commit_message>
Dealer onboarding: add the W-9 request email template
Written as step 4b, before the link rather than after. A dealer holding their
registration link and already working is much harder to chase for paperwork than
one waiting on it, and every dealer clears the $600 reporting threshold on their
first sale several times over, so there is no version of this that can wait.

Recorded where the form must not go. A W-9 carries a taxpayer identification
number, so it does not belong in contact@enyrgy.com or any address staff and
agents can read. That address is documented in the KB as safe to give out, which
is exactly why the exception needs stating here.

Co-Authored-By: Claude Opus 5 <noreply@anthropic.com>
</commit_message>
<xml_diff>
--- a/campaigns/dealer-onboarding.docx
+++ b/campaigns/dealer-onboarding.docx
@@ -2,7 +2,7 @@
 <file path=word/document.xml><?xml version="1.0" encoding="utf-8"?>
 <w:document xmlns:w="http://schemas.openxmlformats.org/wordprocessingml/2006/main" xmlns:m="http://schemas.openxmlformats.org/officeDocument/2006/math" xmlns:r="http://schemas.openxmlformats.org/officeDocument/2006/relationships" xmlns:o="urn:schemas-microsoft-com:office:office" xmlns:v="urn:schemas-microsoft-com:vml" xmlns:w10="urn:schemas-microsoft-com:office:word" xmlns:a="http://schemas.openxmlformats.org/drawingml/2006/main" xmlns:pic="http://schemas.openxmlformats.org/drawingml/2006/picture" xmlns:wp="http://schemas.openxmlformats.org/drawingml/2006/wordprocessingDrawing">
   <w:body>
-    <w:bookmarkStart w:id="21" w:name="dealer-onboarding"/>
+    <w:bookmarkStart w:id="32" w:name="dealer-onboarding"/>
     <w:p>
       <w:pPr>
         <w:pStyle w:val="Heading1"/>
@@ -80,7 +80,7 @@
         </w:pict>
       </w:r>
     </w:p>
-    <w:bookmarkStart w:id="9" w:name="why-there-is-a-form-per-dealer"/>
+    <w:bookmarkStart w:id="19" w:name="why-there-is-a-form-per-dealer"/>
     <w:p>
       <w:pPr>
         <w:pStyle w:val="Heading2"/>
@@ -153,8 +153,8 @@
         </w:pict>
       </w:r>
     </w:p>
-    <w:bookmarkEnd w:id="9"/>
-    <w:bookmarkStart w:id="15" w:name="the-five-steps"/>
+    <w:bookmarkEnd w:id="19"/>
+    <w:bookmarkStart w:id="26" w:name="the-five-steps"/>
     <w:p>
       <w:pPr>
         <w:pStyle w:val="Heading2"/>
@@ -163,7 +163,7 @@
         <w:t xml:space="preserve">The five steps</w:t>
       </w:r>
     </w:p>
-    <w:bookmarkStart w:id="10" w:name="duplicate-the-form"/>
+    <w:bookmarkStart w:id="20" w:name="duplicate-the-form"/>
     <w:p>
       <w:pPr>
         <w:pStyle w:val="Heading3"/>
@@ -206,8 +206,8 @@
         <w:t xml:space="preserve">Dealer Registration - &lt;Dealer Company Name&gt;</w:t>
       </w:r>
     </w:p>
-    <w:bookmarkEnd w:id="10"/>
-    <w:bookmarkStart w:id="11" w:name="set-their-single-dropdown-option"/>
+    <w:bookmarkEnd w:id="20"/>
+    <w:bookmarkStart w:id="21" w:name="set-their-single-dropdown-option"/>
     <w:p>
       <w:pPr>
         <w:pStyle w:val="Heading3"/>
@@ -259,8 +259,8 @@
         <w:t xml:space="preserve">Their dropdown now contains one entry. They learn nothing about anyone else.</w:t>
       </w:r>
     </w:p>
-    <w:bookmarkEnd w:id="11"/>
-    <w:bookmarkStart w:id="12" w:name="add-the-new-form-to-wf-40s-trigger"/>
+    <w:bookmarkEnd w:id="21"/>
+    <w:bookmarkStart w:id="22" w:name="add-the-new-form-to-wf-40s-trigger"/>
     <w:p>
       <w:pPr>
         <w:pStyle w:val="Heading3"/>
@@ -366,8 +366,8 @@
         <w:t xml:space="preserve">tag never lands. And the dealer believes they hold a claim they do not have.</w:t>
       </w:r>
     </w:p>
-    <w:bookmarkEnd w:id="12"/>
-    <w:bookmarkStart w:id="13" w:name="collect-the-right-tax-form"/>
+    <w:bookmarkEnd w:id="22"/>
+    <w:bookmarkStart w:id="23" w:name="collect-the-right-tax-form"/>
     <w:p>
       <w:pPr>
         <w:pStyle w:val="Heading3"/>
@@ -445,8 +445,182 @@
         <w:t xml:space="preserve">Every dealer clears the US $600 reporting threshold on their first sale, several times over, so there is no volume below which this can be skipped.</w:t>
       </w:r>
     </w:p>
-    <w:bookmarkEnd w:id="13"/>
-    <w:bookmarkStart w:id="14" w:name="send-them-their-link"/>
+    <w:bookmarkEnd w:id="23"/>
+    <w:bookmarkStart w:id="24" w:name="b.-the-w-9-request-email"/>
+    <w:p>
+      <w:pPr>
+        <w:pStyle w:val="Heading3"/>
+      </w:pPr>
+      <w:r>
+        <w:t xml:space="preserve">4b. The W-9 request email</w:t>
+      </w:r>
+    </w:p>
+    <w:p>
+      <w:pPr>
+        <w:pStyle w:val="FirstParagraph"/>
+      </w:pPr>
+      <w:r>
+        <w:t xml:space="preserve">Template. Replace the bracketed fields.</w:t>
+      </w:r>
+      <w:r>
+        <w:t xml:space="preserve"> </w:t>
+      </w:r>
+      <w:r>
+        <w:rPr>
+          <w:b/>
+          <w:bCs/>
+        </w:rPr>
+        <w:t xml:space="preserve">Send it before the registration link</w:t>
+      </w:r>
+      <w:r>
+        <w:t xml:space="preserve">, not after: a dealer who has their link and is already working is much harder to chase for paperwork than one who is waiting on it.</w:t>
+      </w:r>
+    </w:p>
+    <w:p>
+      <w:pPr>
+        <w:pStyle w:val="BodyText"/>
+      </w:pPr>
+      <w:r>
+        <w:rPr>
+          <w:b/>
+          <w:bCs/>
+        </w:rPr>
+        <w:t xml:space="preserve">Subject:</w:t>
+      </w:r>
+      <w:r>
+        <w:t xml:space="preserve"> </w:t>
+      </w:r>
+      <w:r>
+        <w:rPr>
+          <w:rStyle w:val="VerbatimChar"/>
+        </w:rPr>
+        <w:t xml:space="preserve">One piece of paperwork before we switch you on</w:t>
+      </w:r>
+    </w:p>
+    <w:p>
+      <w:pPr>
+        <w:pStyle w:val="SourceCode"/>
+      </w:pPr>
+      <w:r>
+        <w:rPr>
+          <w:rStyle w:val="VerbatimChar"/>
+        </w:rPr>
+        <w:t xml:space="preserve">[First name],</w:t>
+      </w:r>
+      <w:r>
+        <w:br/>
+      </w:r>
+      <w:r>
+        <w:br/>
+      </w:r>
+      <w:r>
+        <w:rPr>
+          <w:rStyle w:val="VerbatimChar"/>
+        </w:rPr>
+        <w:t xml:space="preserve">Good to have you on board.</w:t>
+      </w:r>
+      <w:r>
+        <w:br/>
+      </w:r>
+      <w:r>
+        <w:br/>
+      </w:r>
+      <w:r>
+        <w:rPr>
+          <w:rStyle w:val="VerbatimChar"/>
+        </w:rPr>
+        <w:t xml:space="preserve">One administrative thing before we can process commissions. I need a completed W-9 from [Dealer Company Name]. It is the standard IRS form for reporting commission payments, and we cannot pay against a sale without one on file.</w:t>
+      </w:r>
+      <w:r>
+        <w:br/>
+      </w:r>
+      <w:r>
+        <w:br/>
+      </w:r>
+      <w:r>
+        <w:rPr>
+          <w:rStyle w:val="VerbatimChar"/>
+        </w:rPr>
+        <w:t xml:space="preserve">If you need a blank, the current form is here: https://www.irs.gov/pub/irs-pdf/fw9.pdf</w:t>
+      </w:r>
+      <w:r>
+        <w:br/>
+      </w:r>
+      <w:r>
+        <w:br/>
+      </w:r>
+      <w:r>
+        <w:rPr>
+          <w:rStyle w:val="VerbatimChar"/>
+        </w:rPr>
+        <w:t xml:space="preserve">Send it back to me directly at [Scott's address] rather than to a general inbox. It carries your EIN and I would rather it went to one person than sat in a shared mailbox.</w:t>
+      </w:r>
+      <w:r>
+        <w:br/>
+      </w:r>
+      <w:r>
+        <w:br/>
+      </w:r>
+      <w:r>
+        <w:rPr>
+          <w:rStyle w:val="VerbatimChar"/>
+        </w:rPr>
+        <w:t xml:space="preserve">As soon as it is in, I will send your registration link and you are live.</w:t>
+      </w:r>
+    </w:p>
+    <w:p>
+      <w:pPr>
+        <w:pStyle w:val="FirstParagraph"/>
+      </w:pPr>
+      <w:r>
+        <w:rPr>
+          <w:b/>
+          <w:bCs/>
+        </w:rPr>
+        <w:t xml:space="preserve">Non-US dealers get a W-8BEN or W-8BEN-E instead.</w:t>
+      </w:r>
+      <w:r>
+        <w:t xml:space="preserve"> </w:t>
+      </w:r>
+      <w:r>
+        <w:t xml:space="preserve">Same email, swap the form and drop the IRS link, which is US-specific.</w:t>
+      </w:r>
+    </w:p>
+    <w:p>
+      <w:pPr>
+        <w:pStyle w:val="BodyText"/>
+      </w:pPr>
+      <w:r>
+        <w:rPr>
+          <w:b/>
+          <w:bCs/>
+        </w:rPr>
+        <w:t xml:space="preserve">On where it goes.</w:t>
+      </w:r>
+      <w:r>
+        <w:t xml:space="preserve"> </w:t>
+      </w:r>
+      <w:r>
+        <w:t xml:space="preserve">A W-9 carries a taxpayer identification number. Do not route it to</w:t>
+      </w:r>
+      <w:r>
+        <w:t xml:space="preserve"> </w:t>
+      </w:r>
+      <w:r>
+        <w:rPr>
+          <w:rStyle w:val="VerbatimChar"/>
+        </w:rPr>
+        <w:t xml:space="preserve">contact@enyrgy.com</w:t>
+      </w:r>
+      <w:r>
+        <w:t xml:space="preserve"> </w:t>
+      </w:r>
+      <w:r>
+        <w:t xml:space="preserve">or any address that staff or agents can read. It belongs with whoever holds finance records, and nowhere else.</w:t>
+      </w:r>
+    </w:p>
+    <w:bookmarkEnd w:id="24"/>
+    <w:bookmarkStart w:id="25" w:name="send-them-their-link"/>
     <w:p>
       <w:pPr>
         <w:pStyle w:val="Heading3"/>
@@ -479,9 +653,9 @@
         </w:pict>
       </w:r>
     </w:p>
-    <w:bookmarkEnd w:id="14"/>
-    <w:bookmarkEnd w:id="15"/>
-    <w:bookmarkStart w:id="16" w:name="adding-them-to-the-field-options"/>
+    <w:bookmarkEnd w:id="25"/>
+    <w:bookmarkEnd w:id="26"/>
+    <w:bookmarkStart w:id="27" w:name="adding-them-to-the-field-options"/>
     <w:p>
       <w:pPr>
         <w:pStyle w:val="Heading2"/>
@@ -540,8 +714,8 @@
         </w:pict>
       </w:r>
     </w:p>
-    <w:bookmarkEnd w:id="16"/>
-    <w:bookmarkStart w:id="17" w:name="what-unassigned-means"/>
+    <w:bookmarkEnd w:id="27"/>
+    <w:bookmarkStart w:id="28" w:name="what-unassigned-means"/>
     <w:p>
       <w:pPr>
         <w:pStyle w:val="Heading2"/>
@@ -635,8 +809,8 @@
         </w:pict>
       </w:r>
     </w:p>
-    <w:bookmarkEnd w:id="17"/>
-    <w:bookmarkStart w:id="18" w:name="offboarding"/>
+    <w:bookmarkEnd w:id="28"/>
+    <w:bookmarkStart w:id="29" w:name="offboarding"/>
     <w:p>
       <w:pPr>
         <w:pStyle w:val="Heading2"/>
@@ -683,8 +857,8 @@
         </w:pict>
       </w:r>
     </w:p>
-    <w:bookmarkEnd w:id="18"/>
-    <w:bookmarkStart w:id="19" w:name="change-log-2026-08-19"/>
+    <w:bookmarkEnd w:id="29"/>
+    <w:bookmarkStart w:id="30" w:name="change-log-2026-08-19"/>
     <w:p>
       <w:pPr>
         <w:pStyle w:val="Heading2"/>
@@ -695,6 +869,14 @@
     </w:p>
     <w:tbl>
       <w:tblPr>
+        <w:tblBorders>
+          <w:top w:val="single" w:sz="4" w:space="0" w:color="auto"/>
+          <w:left w:val="single" w:sz="4" w:space="0" w:color="auto"/>
+          <w:bottom w:val="single" w:sz="4" w:space="0" w:color="auto"/>
+          <w:right w:val="single" w:sz="4" w:space="0" w:color="auto"/>
+          <w:insideH w:val="single" w:sz="4" w:space="0" w:color="auto"/>
+          <w:insideV w:val="single" w:sz="4" w:space="0" w:color="auto"/>
+        </w:tblBorders>
         <w:tblStyle w:val="Table"/>
         <w:tblW w:type="auto" w:w="0"/>
         <w:tblLook w:firstRow="1" w:lastRow="0" w:firstColumn="0" w:lastColumn="0" w:noHBand="0" w:noVBand="0" w:val="0020"/>
@@ -755,8 +937,8 @@
         </w:tc>
       </w:tr>
     </w:tbl>
-    <w:bookmarkEnd w:id="19"/>
-    <w:bookmarkStart w:id="20" w:name="why-this-document-exists"/>
+    <w:bookmarkEnd w:id="30"/>
+    <w:bookmarkStart w:id="31" w:name="why-this-document-exists"/>
     <w:p>
       <w:pPr>
         <w:pStyle w:val="Heading2"/>
@@ -781,12 +963,14 @@
         <w:t xml:space="preserve">The whole document exists to prevent that one mistake, and to make step 3 hard to skip.</w:t>
       </w:r>
     </w:p>
-    <w:bookmarkEnd w:id="20"/>
-    <w:bookmarkEnd w:id="21"/>
+    <w:bookmarkEnd w:id="31"/>
+    <w:bookmarkEnd w:id="32"/>
     <w:sectPr>
-      <w:footnotePr>
-        <w:numRestart w:val="eachSect"/>
-      </w:footnotePr>
+      <w:headerReference r:id="rId9" w:type="default"/>
+      <w:footerReference r:id="rId10" w:type="default"/>
+      <w:pgSz w:h="15840" w:w="12240"/>
+      <w:pgMar w:bottom="1440" w:footer="720" w:gutter="0" w:header="720" w:left="1440" w:right="1440" w:top="1440"/>
+      <w:cols w:space="720"/>
     </w:sectPr>
   </w:body>
 </w:document>
@@ -796,6 +980,154 @@
 <w:comments xmlns:w="http://schemas.openxmlformats.org/wordprocessingml/2006/main" xmlns:m="http://schemas.openxmlformats.org/officeDocument/2006/math" xmlns:r="http://schemas.openxmlformats.org/officeDocument/2006/relationships" xmlns:o="urn:schemas-microsoft-com:office:office" xmlns:v="urn:schemas-microsoft-com:vml" xmlns:w10="urn:schemas-microsoft-com:office:word" xmlns:a="http://schemas.openxmlformats.org/drawingml/2006/main" xmlns:pic="http://schemas.openxmlformats.org/drawingml/2006/picture" xmlns:wp="http://schemas.openxmlformats.org/drawingml/2006/wordprocessingDrawing"/>
 </file>
 
+<file path=word/footer1.xml><?xml version="1.0" encoding="utf-8"?>
+<w:ftr xmlns:wpc="http://schemas.microsoft.com/office/word/2010/wordprocessingCanvas" xmlns:cx="http://schemas.microsoft.com/office/drawing/2014/chartex" xmlns:cx1="http://schemas.microsoft.com/office/drawing/2015/9/8/chartex" xmlns:cx2="http://schemas.microsoft.com/office/drawing/2015/10/21/chartex" xmlns:cx3="http://schemas.microsoft.com/office/drawing/2016/5/9/chartex" xmlns:cx4="http://schemas.microsoft.com/office/drawing/2016/5/10/chartex" xmlns:cx5="http://schemas.microsoft.com/office/drawing/2016/5/11/chartex" xmlns:cx6="http://schemas.microsoft.com/office/drawing/2016/5/12/chartex" xmlns:cx7="http://schemas.microsoft.com/office/drawing/2016/5/13/chartex" xmlns:cx8="http://schemas.microsoft.com/office/drawing/2016/5/14/chartex" xmlns:mc="http://schemas.openxmlformats.org/markup-compatibility/2006" xmlns:m="http://schemas.openxmlformats.org/officeDocument/2006/math" xmlns:aink="http://schemas.microsoft.com/office/drawing/2016/ink" xmlns:am3d="http://schemas.microsoft.com/office/drawing/2017/model3d" xmlns:oel="http://schemas.microsoft.com/office/2019/extlst" xmlns:r="http://schemas.openxmlformats.org/officeDocument/2006/relationships" xmlns:wp14="http://schemas.microsoft.com/office/word/2010/wordprocessingDrawing" xmlns:wp="http://schemas.openxmlformats.org/drawingml/2006/wordprocessingDrawing" xmlns:wpg="http://schemas.microsoft.com/office/word/2010/wordprocessingGroup" xmlns:wpi="http://schemas.microsoft.com/office/word/2010/wordprocessingInk" xmlns:wps="http://schemas.microsoft.com/office/word/2010/wordprocessingShape" xmlns:o="urn:schemas-microsoft-com:office:office" xmlns:v="urn:schemas-microsoft-com:vml" xmlns:w10="urn:schemas-microsoft-com:office:word" xmlns:w="http://schemas.openxmlformats.org/wordprocessingml/2006/main" xmlns:w14="http://schemas.microsoft.com/office/word/2010/wordml" xmlns:w15="http://schemas.microsoft.com/office/word/2012/wordml" xmlns:w16cex="http://schemas.microsoft.com/office/word/2018/wordml/cex" xmlns:w16cid="http://schemas.microsoft.com/office/word/2016/wordml/cid" xmlns:w16="http://schemas.microsoft.com/office/word/2018/wordml" xmlns:w16sdtdh="http://schemas.microsoft.com/office/word/2020/wordml/sdtdatahash" xmlns:w16sdtfl="http://schemas.microsoft.com/office/word/2024/wordml/sdtformatlock" xmlns:w16se="http://schemas.microsoft.com/office/word/2015/wordml/symex" xmlns:w16du="http://schemas.microsoft.com/office/word/2023/wordml/word16du" xmlns:wne="http://schemas.microsoft.com/office/word/2006/wordml" mc:Ignorable="w14 w15 w16se w16cid w16 w16cex w16sdtdh w16sdtfl w16du wp14">
+  <w:p>
+    <w:pPr>
+      <w:pBdr>
+        <w:top w:val="single" w:sz="4" w:space="1" w:color="CCCCCC"/>
+      </w:pBdr>
+      <w:jc w:val="center"/>
+    </w:pPr>
+    <w:r>
+      <w:rPr>
+        <w:rFonts w:ascii="Montserrat" w:eastAsia="Montserrat" w:hAnsi="Montserrat" w:cs="Montserrat"/>
+        <w:color w:val="888888"/>
+        <w:sz w:val="16"/>
+        <w:szCs w:val="16"/>
+      </w:rPr>
+      <w:t xml:space="preserve">Enyrgy </w:t>
+    </w:r>
+    <w:proofErr w:type="gramStart"/>
+    <w:r>
+      <w:rPr>
+        <w:rFonts w:ascii="Montserrat" w:eastAsia="Montserrat" w:hAnsi="Montserrat" w:cs="Montserrat"/>
+        <w:color w:val="888888"/>
+        <w:sz w:val="16"/>
+        <w:szCs w:val="16"/>
+      </w:rPr>
+      <w:t>Inc  ·</w:t>
+    </w:r>
+    <w:proofErr w:type="gramEnd"/>
+    <w:r>
+      <w:rPr>
+        <w:rFonts w:ascii="Montserrat" w:eastAsia="Montserrat" w:hAnsi="Montserrat" w:cs="Montserrat"/>
+        <w:color w:val="888888"/>
+        <w:sz w:val="16"/>
+        <w:szCs w:val="16"/>
+      </w:rPr>
+      <w:t xml:space="preserve">  Phoenix, </w:t>
+    </w:r>
+    <w:proofErr w:type="gramStart"/>
+    <w:r>
+      <w:rPr>
+        <w:rFonts w:ascii="Montserrat" w:eastAsia="Montserrat" w:hAnsi="Montserrat" w:cs="Montserrat"/>
+        <w:color w:val="888888"/>
+        <w:sz w:val="16"/>
+        <w:szCs w:val="16"/>
+      </w:rPr>
+      <w:t>AZ  ·</w:t>
+    </w:r>
+    <w:proofErr w:type="gramEnd"/>
+    <w:r>
+      <w:rPr>
+        <w:rFonts w:ascii="Montserrat" w:eastAsia="Montserrat" w:hAnsi="Montserrat" w:cs="Montserrat"/>
+        <w:color w:val="888888"/>
+        <w:sz w:val="16"/>
+        <w:szCs w:val="16"/>
+      </w:rPr>
+      <w:t xml:space="preserve">  </w:t>
+    </w:r>
+    <w:proofErr w:type="gramStart"/>
+    <w:r>
+      <w:rPr>
+        <w:rFonts w:ascii="Montserrat" w:eastAsia="Montserrat" w:hAnsi="Montserrat" w:cs="Montserrat"/>
+        <w:color w:val="888888"/>
+        <w:sz w:val="16"/>
+        <w:szCs w:val="16"/>
+      </w:rPr>
+      <w:t>enyrgy.com  ·</w:t>
+    </w:r>
+    <w:proofErr w:type="gramEnd"/>
+    <w:r>
+      <w:rPr>
+        <w:rFonts w:ascii="Montserrat" w:eastAsia="Montserrat" w:hAnsi="Montserrat" w:cs="Montserrat"/>
+        <w:color w:val="888888"/>
+        <w:sz w:val="16"/>
+        <w:szCs w:val="16"/>
+      </w:rPr>
+      <w:t xml:space="preserve">  Sunlight. Evolved.  </w:t>
+    </w:r>
+    <w:proofErr w:type="gramStart"/>
+    <w:r>
+      <w:rPr>
+        <w:rFonts w:ascii="Montserrat" w:eastAsia="Montserrat" w:hAnsi="Montserrat" w:cs="Montserrat"/>
+        <w:color w:val="888888"/>
+        <w:sz w:val="16"/>
+        <w:szCs w:val="16"/>
+      </w:rPr>
+      <w:t>·  Page</w:t>
+    </w:r>
+    <w:proofErr w:type="gramEnd"/>
+    <w:r>
+      <w:rPr>
+        <w:rFonts w:ascii="Montserrat" w:eastAsia="Montserrat" w:hAnsi="Montserrat" w:cs="Montserrat"/>
+        <w:color w:val="888888"/>
+        <w:sz w:val="16"/>
+        <w:szCs w:val="16"/>
+      </w:rPr>
+      <w:t xml:space="preserve"> </w:t>
+    </w:r>
+    <w:r>
+      <w:rPr>
+        <w:rFonts w:ascii="Montserrat" w:eastAsia="Montserrat" w:hAnsi="Montserrat" w:cs="Montserrat"/>
+        <w:color w:val="888888"/>
+        <w:sz w:val="16"/>
+        <w:szCs w:val="16"/>
+      </w:rPr>
+      <w:fldChar w:fldCharType="begin"/>
+    </w:r>
+    <w:r>
+      <w:rPr>
+        <w:rFonts w:ascii="Montserrat" w:eastAsia="Montserrat" w:hAnsi="Montserrat" w:cs="Montserrat"/>
+        <w:color w:val="888888"/>
+        <w:sz w:val="16"/>
+        <w:szCs w:val="16"/>
+      </w:rPr>
+      <w:instrText>PAGE</w:instrText>
+    </w:r>
+    <w:r>
+      <w:rPr>
+        <w:rFonts w:ascii="Montserrat" w:eastAsia="Montserrat" w:hAnsi="Montserrat" w:cs="Montserrat"/>
+        <w:color w:val="888888"/>
+        <w:sz w:val="16"/>
+        <w:szCs w:val="16"/>
+      </w:rPr>
+      <w:fldChar w:fldCharType="separate"/>
+    </w:r>
+    <w:r>
+      <w:rPr>
+        <w:rFonts w:ascii="Montserrat" w:eastAsia="Montserrat" w:hAnsi="Montserrat" w:cs="Montserrat"/>
+        <w:noProof/>
+        <w:color w:val="888888"/>
+        <w:sz w:val="16"/>
+        <w:szCs w:val="16"/>
+      </w:rPr>
+      <w:t>8</w:t>
+    </w:r>
+    <w:r>
+      <w:rPr>
+        <w:rFonts w:ascii="Montserrat" w:eastAsia="Montserrat" w:hAnsi="Montserrat" w:cs="Montserrat"/>
+        <w:color w:val="888888"/>
+        <w:sz w:val="16"/>
+        <w:szCs w:val="16"/>
+      </w:rPr>
+      <w:fldChar w:fldCharType="end"/>
+    </w:r>
+  </w:p>
+</w:ftr>
+</file>
+
 <file path=word/footnotes.xml><?xml version="1.0" encoding="utf-8"?>
 <w:footnotes xmlns:w="http://schemas.openxmlformats.org/wordprocessingml/2006/main" xmlns:m="http://schemas.openxmlformats.org/officeDocument/2006/math" xmlns:r="http://schemas.openxmlformats.org/officeDocument/2006/relationships" xmlns:o="urn:schemas-microsoft-com:office:office" xmlns:v="urn:schemas-microsoft-com:vml" xmlns:w10="urn:schemas-microsoft-com:office:word" xmlns:a="http://schemas.openxmlformats.org/drawingml/2006/main" xmlns:pic="http://schemas.openxmlformats.org/drawingml/2006/picture" xmlns:wp="http://schemas.openxmlformats.org/drawingml/2006/wordprocessingDrawing">
   <w:footnote w:type="continuationSeparator" w:id="0">
@@ -815,8 +1147,487 @@
 </w:footnotes>
 </file>
 
+<file path=word/header1.xml><?xml version="1.0" encoding="utf-8"?>
+<w:hdr xmlns:wpc="http://schemas.microsoft.com/office/word/2010/wordprocessingCanvas" xmlns:cx="http://schemas.microsoft.com/office/drawing/2014/chartex" xmlns:cx1="http://schemas.microsoft.com/office/drawing/2015/9/8/chartex" xmlns:cx2="http://schemas.microsoft.com/office/drawing/2015/10/21/chartex" xmlns:cx3="http://schemas.microsoft.com/office/drawing/2016/5/9/chartex" xmlns:cx4="http://schemas.microsoft.com/office/drawing/2016/5/10/chartex" xmlns:cx5="http://schemas.microsoft.com/office/drawing/2016/5/11/chartex" xmlns:cx6="http://schemas.microsoft.com/office/drawing/2016/5/12/chartex" xmlns:cx7="http://schemas.microsoft.com/office/drawing/2016/5/13/chartex" xmlns:cx8="http://schemas.microsoft.com/office/drawing/2016/5/14/chartex" xmlns:mc="http://schemas.openxmlformats.org/markup-compatibility/2006" xmlns:m="http://schemas.openxmlformats.org/officeDocument/2006/math" xmlns:aink="http://schemas.microsoft.com/office/drawing/2016/ink" xmlns:am3d="http://schemas.microsoft.com/office/drawing/2017/model3d" xmlns:oel="http://schemas.microsoft.com/office/2019/extlst" xmlns:r="http://schemas.openxmlformats.org/officeDocument/2006/relationships" xmlns:wp14="http://schemas.microsoft.com/office/word/2010/wordprocessingDrawing" xmlns:wp="http://schemas.openxmlformats.org/drawingml/2006/wordprocessingDrawing" xmlns:wpg="http://schemas.microsoft.com/office/word/2010/wordprocessingGroup" xmlns:wpi="http://schemas.microsoft.com/office/word/2010/wordprocessingInk" xmlns:wps="http://schemas.microsoft.com/office/word/2010/wordprocessingShape" xmlns:o="urn:schemas-microsoft-com:office:office" xmlns:v="urn:schemas-microsoft-com:vml" xmlns:w10="urn:schemas-microsoft-com:office:word" xmlns:w="http://schemas.openxmlformats.org/wordprocessingml/2006/main" xmlns:w14="http://schemas.microsoft.com/office/word/2010/wordml" xmlns:w15="http://schemas.microsoft.com/office/word/2012/wordml" xmlns:w16cex="http://schemas.microsoft.com/office/word/2018/wordml/cex" xmlns:w16cid="http://schemas.microsoft.com/office/word/2016/wordml/cid" xmlns:w16="http://schemas.microsoft.com/office/word/2018/wordml" xmlns:w16sdtdh="http://schemas.microsoft.com/office/word/2020/wordml/sdtdatahash" xmlns:w16sdtfl="http://schemas.microsoft.com/office/word/2024/wordml/sdtformatlock" xmlns:w16se="http://schemas.microsoft.com/office/word/2015/wordml/symex" xmlns:w16du="http://schemas.microsoft.com/office/word/2023/wordml/word16du" xmlns:wne="http://schemas.microsoft.com/office/word/2006/wordml" mc:Ignorable="w14 w15 w16se w16cid w16 w16cex w16sdtdh w16sdtfl w16du wp14">
+  <w:p>
+    <w:pPr>
+      <w:pBdr>
+        <w:bottom w:val="single" w:sz="4" w:space="1" w:color="E64C38"/>
+      </w:pBdr>
+    </w:pPr>
+    <w:r>
+      <w:rPr>
+        <w:rFonts w:ascii="Montserrat" w:eastAsia="Montserrat" w:hAnsi="Montserrat" w:cs="Montserrat"/>
+        <w:b/>
+        <w:bCs/>
+        <w:color w:val="E64C38"/>
+        <w:sz w:val="18"/>
+        <w:szCs w:val="18"/>
+      </w:rPr>
+      <w:t xml:space="preserve">ENYRGY | dealer-onboarding </w:t>
+    </w:r>
+    <w:proofErr w:type="gramStart"/>
+    <w:r>
+      <w:rPr>
+        <w:rFonts w:ascii="Montserrat" w:eastAsia="Montserrat" w:hAnsi="Montserrat" w:cs="Montserrat"/>
+        <w:b/>
+        <w:bCs/>
+        <w:color w:val="E64C38"/>
+        <w:sz w:val="18"/>
+        <w:szCs w:val="18"/>
+      </w:rPr>
+      <w:t xml:space="preserve">  </w:t>
+    </w:r>
+    <w:r>
+      <w:rPr>
+        <w:rFonts w:ascii="Montserrat" w:eastAsia="Montserrat" w:hAnsi="Montserrat" w:cs="Montserrat"/>
+        <w:color w:val="999999"/>
+        <w:sz w:val="18"/>
+        <w:szCs w:val="18"/>
+      </w:rPr>
+      <w:t>CONFIDENTIAL</w:t>
+    </w:r>
+    <w:proofErr w:type="gramEnd"/>
+  </w:p>
+</w:hdr>
+</file>
+
 <file path=word/numbering.xml><?xml version="1.0" encoding="utf-8"?>
-<w:numbering xmlns:w="http://schemas.openxmlformats.org/wordprocessingml/2006/main">
+<w:numbering xmlns:aink="http://schemas.microsoft.com/office/drawing/2016/ink" xmlns:am3d="http://schemas.microsoft.com/office/drawing/2017/model3d" xmlns:cx="http://schemas.microsoft.com/office/drawing/2014/chartex" xmlns:cx1="http://schemas.microsoft.com/office/drawing/2015/9/8/chartex" xmlns:cx2="http://schemas.microsoft.com/office/drawing/2015/10/21/chartex" xmlns:cx3="http://schemas.microsoft.com/office/drawing/2016/5/9/chartex" xmlns:cx4="http://schemas.microsoft.com/office/drawing/2016/5/10/chartex" xmlns:cx5="http://schemas.microsoft.com/office/drawing/2016/5/11/chartex" xmlns:cx6="http://schemas.microsoft.com/office/drawing/2016/5/12/chartex" xmlns:cx7="http://schemas.microsoft.com/office/drawing/2016/5/13/chartex" xmlns:cx8="http://schemas.microsoft.com/office/drawing/2016/5/14/chartex" xmlns:m="http://schemas.openxmlformats.org/officeDocument/2006/math" xmlns:mc="http://schemas.openxmlformats.org/markup-compatibility/2006" xmlns:o="urn:schemas-microsoft-com:office:office" xmlns:oel="http://schemas.microsoft.com/office/2019/extlst" xmlns:r="http://schemas.openxmlformats.org/officeDocument/2006/relationships" xmlns:v="urn:schemas-microsoft-com:vml" xmlns:w="http://schemas.openxmlformats.org/wordprocessingml/2006/main" xmlns:w10="urn:schemas-microsoft-com:office:word" xmlns:w14="http://schemas.microsoft.com/office/word/2010/wordml" xmlns:w15="http://schemas.microsoft.com/office/word/2012/wordml" xmlns:w16="http://schemas.microsoft.com/office/word/2018/wordml" xmlns:w16cex="http://schemas.microsoft.com/office/word/2018/wordml/cex" xmlns:w16cid="http://schemas.microsoft.com/office/word/2016/wordml/cid" xmlns:w16du="http://schemas.microsoft.com/office/word/2023/wordml/word16du" xmlns:w16sdtdh="http://schemas.microsoft.com/office/word/2020/wordml/sdtdatahash" xmlns:w16sdtfl="http://schemas.microsoft.com/office/word/2024/wordml/sdtformatlock" xmlns:w16se="http://schemas.microsoft.com/office/word/2015/wordml/symex" xmlns:wne="http://schemas.microsoft.com/office/word/2006/wordml" xmlns:wp="http://schemas.openxmlformats.org/drawingml/2006/wordprocessingDrawing" xmlns:wp14="http://schemas.microsoft.com/office/word/2010/wordprocessingDrawing" xmlns:wpc="http://schemas.microsoft.com/office/word/2010/wordprocessingCanvas" xmlns:wpg="http://schemas.microsoft.com/office/word/2010/wordprocessingGroup" xmlns:wpi="http://schemas.microsoft.com/office/word/2010/wordprocessingInk" xmlns:wps="http://schemas.microsoft.com/office/word/2010/wordprocessingShape" mc:Ignorable="w14 w15 w16se w16cid w16 w16cex w16sdtdh w16sdtfl w16du wp14">
+  <w:abstractNum w15:restartNumberingAfterBreak="0" w:abstractNumId="0">
+    <w:nsid w:val="EA454B4C"/>
+    <w:multiLevelType w:val="multilevel"/>
+    <w:tmpl w:val="BDE24088"/>
+    <w:lvl w:ilvl="0">
+      <w:numFmt w:val="bullet"/>
+      <w:lvlText w:val="•"/>
+      <w:lvlJc w:val="left"/>
+      <w:pPr>
+        <w:tabs>
+          <w:tab w:pos="0" w:val="num"/>
+        </w:tabs>
+        <w:ind w:hanging="480" w:left="480"/>
+      </w:pPr>
+    </w:lvl>
+    <w:lvl w:ilvl="1">
+      <w:numFmt w:val="bullet"/>
+      <w:lvlText w:val="–"/>
+      <w:lvlJc w:val="left"/>
+      <w:pPr>
+        <w:tabs>
+          <w:tab w:pos="720" w:val="num"/>
+        </w:tabs>
+        <w:ind w:hanging="480" w:left="1200"/>
+      </w:pPr>
+    </w:lvl>
+    <w:lvl w:ilvl="2">
+      <w:numFmt w:val="bullet"/>
+      <w:lvlText w:val="•"/>
+      <w:lvlJc w:val="left"/>
+      <w:pPr>
+        <w:tabs>
+          <w:tab w:pos="1440" w:val="num"/>
+        </w:tabs>
+        <w:ind w:hanging="480" w:left="1920"/>
+      </w:pPr>
+    </w:lvl>
+    <w:lvl w:ilvl="3">
+      <w:numFmt w:val="bullet"/>
+      <w:lvlText w:val="–"/>
+      <w:lvlJc w:val="left"/>
+      <w:pPr>
+        <w:tabs>
+          <w:tab w:pos="2160" w:val="num"/>
+        </w:tabs>
+        <w:ind w:hanging="480" w:left="2640"/>
+      </w:pPr>
+    </w:lvl>
+    <w:lvl w:ilvl="4">
+      <w:numFmt w:val="bullet"/>
+      <w:lvlText w:val="•"/>
+      <w:lvlJc w:val="left"/>
+      <w:pPr>
+        <w:tabs>
+          <w:tab w:pos="2880" w:val="num"/>
+        </w:tabs>
+        <w:ind w:hanging="480" w:left="3360"/>
+      </w:pPr>
+    </w:lvl>
+    <w:lvl w:ilvl="5">
+      <w:numFmt w:val="bullet"/>
+      <w:lvlText w:val="–"/>
+      <w:lvlJc w:val="left"/>
+      <w:pPr>
+        <w:tabs>
+          <w:tab w:pos="3600" w:val="num"/>
+        </w:tabs>
+        <w:ind w:hanging="480" w:left="4080"/>
+      </w:pPr>
+    </w:lvl>
+    <w:lvl w:ilvl="6">
+      <w:numFmt w:val="bullet"/>
+      <w:lvlText w:val="•"/>
+      <w:lvlJc w:val="left"/>
+      <w:pPr>
+        <w:tabs>
+          <w:tab w:pos="4320" w:val="num"/>
+        </w:tabs>
+        <w:ind w:hanging="480" w:left="4800"/>
+      </w:pPr>
+    </w:lvl>
+    <w:lvl w:ilvl="7">
+      <w:numFmt w:val="bullet"/>
+      <w:lvlText w:val="–"/>
+      <w:lvlJc w:val="left"/>
+      <w:pPr>
+        <w:tabs>
+          <w:tab w:pos="5040" w:val="num"/>
+        </w:tabs>
+        <w:ind w:hanging="480" w:left="5520"/>
+      </w:pPr>
+    </w:lvl>
+    <w:lvl w:ilvl="8">
+      <w:numFmt w:val="bullet"/>
+      <w:lvlText w:val="•"/>
+      <w:lvlJc w:val="left"/>
+      <w:pPr>
+        <w:tabs>
+          <w:tab w:pos="5760" w:val="num"/>
+        </w:tabs>
+        <w:ind w:hanging="480" w:left="6240"/>
+      </w:pPr>
+    </w:lvl>
+  </w:abstractNum>
+  <w:abstractNum w15:restartNumberingAfterBreak="0" w:abstractNumId="1">
+    <w:nsid w:val="2C1AE401"/>
+    <w:multiLevelType w:val="multilevel"/>
+    <w:tmpl w:val="07FA7514"/>
+    <w:lvl w:ilvl="0">
+      <w:numFmt w:val="bullet"/>
+      <w:lvlText w:val=" "/>
+      <w:lvlJc w:val="left"/>
+      <w:pPr>
+        <w:tabs>
+          <w:tab w:pos="0" w:val="num"/>
+        </w:tabs>
+        <w:ind w:hanging="480" w:left="480"/>
+      </w:pPr>
+    </w:lvl>
+    <w:lvl w:ilvl="1">
+      <w:numFmt w:val="bullet"/>
+      <w:lvlText w:val=" "/>
+      <w:lvlJc w:val="left"/>
+      <w:pPr>
+        <w:tabs>
+          <w:tab w:pos="720" w:val="num"/>
+        </w:tabs>
+        <w:ind w:hanging="480" w:left="1200"/>
+      </w:pPr>
+    </w:lvl>
+    <w:lvl w:ilvl="2">
+      <w:numFmt w:val="bullet"/>
+      <w:lvlText w:val=" "/>
+      <w:lvlJc w:val="left"/>
+      <w:pPr>
+        <w:tabs>
+          <w:tab w:pos="1440" w:val="num"/>
+        </w:tabs>
+        <w:ind w:hanging="480" w:left="1920"/>
+      </w:pPr>
+    </w:lvl>
+    <w:lvl w:ilvl="3">
+      <w:numFmt w:val="bullet"/>
+      <w:lvlText w:val=" "/>
+      <w:lvlJc w:val="left"/>
+      <w:pPr>
+        <w:tabs>
+          <w:tab w:pos="2160" w:val="num"/>
+        </w:tabs>
+        <w:ind w:hanging="480" w:left="2640"/>
+      </w:pPr>
+    </w:lvl>
+    <w:lvl w:ilvl="4">
+      <w:numFmt w:val="bullet"/>
+      <w:lvlText w:val=" "/>
+      <w:lvlJc w:val="left"/>
+      <w:pPr>
+        <w:tabs>
+          <w:tab w:pos="2880" w:val="num"/>
+        </w:tabs>
+        <w:ind w:hanging="480" w:left="3360"/>
+      </w:pPr>
+    </w:lvl>
+    <w:lvl w:ilvl="5">
+      <w:numFmt w:val="bullet"/>
+      <w:lvlText w:val=" "/>
+      <w:lvlJc w:val="left"/>
+      <w:pPr>
+        <w:tabs>
+          <w:tab w:pos="3600" w:val="num"/>
+        </w:tabs>
+        <w:ind w:hanging="480" w:left="4080"/>
+      </w:pPr>
+    </w:lvl>
+    <w:lvl w:ilvl="6">
+      <w:numFmt w:val="bullet"/>
+      <w:lvlText w:val=" "/>
+      <w:lvlJc w:val="left"/>
+      <w:pPr>
+        <w:tabs>
+          <w:tab w:pos="4320" w:val="num"/>
+        </w:tabs>
+        <w:ind w:hanging="480" w:left="4800"/>
+      </w:pPr>
+    </w:lvl>
+    <w:lvl w:ilvl="7">
+      <w:numFmt w:val="bullet"/>
+      <w:lvlText w:val=" "/>
+      <w:lvlJc w:val="left"/>
+      <w:pPr>
+        <w:tabs>
+          <w:tab w:pos="5040" w:val="num"/>
+        </w:tabs>
+        <w:ind w:hanging="480" w:left="5520"/>
+      </w:pPr>
+    </w:lvl>
+    <w:lvl w:ilvl="8">
+      <w:numFmt w:val="bullet"/>
+      <w:lvlText w:val=" "/>
+      <w:lvlJc w:val="left"/>
+      <w:pPr>
+        <w:tabs>
+          <w:tab w:pos="5760" w:val="num"/>
+        </w:tabs>
+        <w:ind w:hanging="480" w:left="6240"/>
+      </w:pPr>
+    </w:lvl>
+  </w:abstractNum>
+  <w:abstractNum w15:restartNumberingAfterBreak="0" w:abstractNumId="2">
+    <w:nsid w:val="47261BAD"/>
+    <w:multiLevelType w:val="multilevel"/>
+    <w:tmpl w:val="8ECE1826"/>
+    <w:lvl w:ilvl="0">
+      <w:start w:val="7"/>
+      <w:numFmt w:val="decimal"/>
+      <w:lvlText w:val="%1."/>
+      <w:lvlJc w:val="left"/>
+      <w:pPr>
+        <w:tabs>
+          <w:tab w:pos="0" w:val="num"/>
+        </w:tabs>
+        <w:ind w:hanging="480" w:left="480"/>
+      </w:pPr>
+    </w:lvl>
+    <w:lvl w:ilvl="1">
+      <w:start w:val="7"/>
+      <w:numFmt w:val="decimal"/>
+      <w:lvlText w:val="%2."/>
+      <w:lvlJc w:val="left"/>
+      <w:pPr>
+        <w:tabs>
+          <w:tab w:pos="720" w:val="num"/>
+        </w:tabs>
+        <w:ind w:hanging="480" w:left="1200"/>
+      </w:pPr>
+    </w:lvl>
+    <w:lvl w:ilvl="2">
+      <w:start w:val="7"/>
+      <w:numFmt w:val="decimal"/>
+      <w:lvlText w:val="%3."/>
+      <w:lvlJc w:val="left"/>
+      <w:pPr>
+        <w:tabs>
+          <w:tab w:pos="1440" w:val="num"/>
+        </w:tabs>
+        <w:ind w:hanging="480" w:left="1920"/>
+      </w:pPr>
+    </w:lvl>
+    <w:lvl w:ilvl="3">
+      <w:start w:val="7"/>
+      <w:numFmt w:val="decimal"/>
+      <w:lvlText w:val="%4."/>
+      <w:lvlJc w:val="left"/>
+      <w:pPr>
+        <w:tabs>
+          <w:tab w:pos="2160" w:val="num"/>
+        </w:tabs>
+        <w:ind w:hanging="480" w:left="2640"/>
+      </w:pPr>
+    </w:lvl>
+    <w:lvl w:ilvl="4">
+      <w:start w:val="7"/>
+      <w:numFmt w:val="decimal"/>
+      <w:lvlText w:val="%5."/>
+      <w:lvlJc w:val="left"/>
+      <w:pPr>
+        <w:tabs>
+          <w:tab w:pos="2880" w:val="num"/>
+        </w:tabs>
+        <w:ind w:hanging="480" w:left="3360"/>
+      </w:pPr>
+    </w:lvl>
+    <w:lvl w:ilvl="5">
+      <w:start w:val="7"/>
+      <w:numFmt w:val="decimal"/>
+      <w:lvlText w:val="%6."/>
+      <w:lvlJc w:val="left"/>
+      <w:pPr>
+        <w:tabs>
+          <w:tab w:pos="3600" w:val="num"/>
+        </w:tabs>
+        <w:ind w:hanging="480" w:left="4080"/>
+      </w:pPr>
+    </w:lvl>
+    <w:lvl w:ilvl="6">
+      <w:start w:val="7"/>
+      <w:numFmt w:val="decimal"/>
+      <w:lvlText w:val="%7."/>
+      <w:lvlJc w:val="left"/>
+      <w:pPr>
+        <w:tabs>
+          <w:tab w:pos="4320" w:val="num"/>
+        </w:tabs>
+        <w:ind w:hanging="480" w:left="4800"/>
+      </w:pPr>
+    </w:lvl>
+    <w:lvl w:ilvl="7">
+      <w:start w:val="7"/>
+      <w:numFmt w:val="decimal"/>
+      <w:lvlText w:val="%8."/>
+      <w:lvlJc w:val="left"/>
+      <w:pPr>
+        <w:tabs>
+          <w:tab w:pos="5040" w:val="num"/>
+        </w:tabs>
+        <w:ind w:hanging="480" w:left="5520"/>
+      </w:pPr>
+    </w:lvl>
+    <w:lvl w:ilvl="8">
+      <w:start w:val="7"/>
+      <w:numFmt w:val="decimal"/>
+      <w:lvlText w:val="%9."/>
+      <w:lvlJc w:val="left"/>
+      <w:pPr>
+        <w:tabs>
+          <w:tab w:pos="5760" w:val="num"/>
+        </w:tabs>
+        <w:ind w:hanging="480" w:left="6240"/>
+      </w:pPr>
+    </w:lvl>
+  </w:abstractNum>
+  <w:abstractNum w15:restartNumberingAfterBreak="0" w:abstractNumId="3">
+    <w:nsid w:val="71315DCA"/>
+    <w:multiLevelType w:val="multilevel"/>
+    <w:tmpl w:val="8F1A713C"/>
+    <w:lvl w:ilvl="0">
+      <w:start w:val="1"/>
+      <w:numFmt w:val="decimal"/>
+      <w:lvlText w:val="%1."/>
+      <w:lvlJc w:val="left"/>
+      <w:pPr>
+        <w:tabs>
+          <w:tab w:pos="0" w:val="num"/>
+        </w:tabs>
+        <w:ind w:hanging="480" w:left="480"/>
+      </w:pPr>
+    </w:lvl>
+    <w:lvl w:ilvl="1">
+      <w:start w:val="1"/>
+      <w:numFmt w:val="decimal"/>
+      <w:lvlText w:val="%2."/>
+      <w:lvlJc w:val="left"/>
+      <w:pPr>
+        <w:tabs>
+          <w:tab w:pos="720" w:val="num"/>
+        </w:tabs>
+        <w:ind w:hanging="480" w:left="1200"/>
+      </w:pPr>
+    </w:lvl>
+    <w:lvl w:ilvl="2">
+      <w:start w:val="1"/>
+      <w:numFmt w:val="decimal"/>
+      <w:lvlText w:val="%3."/>
+      <w:lvlJc w:val="left"/>
+      <w:pPr>
+        <w:tabs>
+          <w:tab w:pos="1440" w:val="num"/>
+        </w:tabs>
+        <w:ind w:hanging="480" w:left="1920"/>
+      </w:pPr>
+    </w:lvl>
+    <w:lvl w:ilvl="3">
+      <w:start w:val="1"/>
+      <w:numFmt w:val="decimal"/>
+      <w:lvlText w:val="%4."/>
+      <w:lvlJc w:val="left"/>
+      <w:pPr>
+        <w:tabs>
+          <w:tab w:pos="2160" w:val="num"/>
+        </w:tabs>
+        <w:ind w:hanging="480" w:left="2640"/>
+      </w:pPr>
+    </w:lvl>
+    <w:lvl w:ilvl="4">
+      <w:start w:val="1"/>
+      <w:numFmt w:val="decimal"/>
+      <w:lvlText w:val="%5."/>
+      <w:lvlJc w:val="left"/>
+      <w:pPr>
+        <w:tabs>
+          <w:tab w:pos="2880" w:val="num"/>
+        </w:tabs>
+        <w:ind w:hanging="480" w:left="3360"/>
+      </w:pPr>
+    </w:lvl>
+    <w:lvl w:ilvl="5">
+      <w:start w:val="1"/>
+      <w:numFmt w:val="decimal"/>
+      <w:lvlText w:val="%6."/>
+      <w:lvlJc w:val="left"/>
+      <w:pPr>
+        <w:tabs>
+          <w:tab w:pos="3600" w:val="num"/>
+        </w:tabs>
+        <w:ind w:hanging="480" w:left="4080"/>
+      </w:pPr>
+    </w:lvl>
+    <w:lvl w:ilvl="6">
+      <w:start w:val="1"/>
+      <w:numFmt w:val="decimal"/>
+      <w:lvlText w:val="%7."/>
+      <w:lvlJc w:val="left"/>
+      <w:pPr>
+        <w:tabs>
+          <w:tab w:pos="4320" w:val="num"/>
+        </w:tabs>
+        <w:ind w:hanging="480" w:left="4800"/>
+      </w:pPr>
+    </w:lvl>
+    <w:lvl w:ilvl="7">
+      <w:start w:val="1"/>
+      <w:numFmt w:val="decimal"/>
+      <w:lvlText w:val="%8."/>
+      <w:lvlJc w:val="left"/>
+      <w:pPr>
+        <w:tabs>
+          <w:tab w:pos="5040" w:val="num"/>
+        </w:tabs>
+        <w:ind w:hanging="480" w:left="5520"/>
+      </w:pPr>
+    </w:lvl>
+    <w:lvl w:ilvl="8">
+      <w:start w:val="1"/>
+      <w:numFmt w:val="decimal"/>
+      <w:lvlText w:val="%9."/>
+      <w:lvlJc w:val="left"/>
+      <w:pPr>
+        <w:tabs>
+          <w:tab w:pos="5760" w:val="num"/>
+        </w:tabs>
+        <w:ind w:hanging="480" w:left="6240"/>
+      </w:pPr>
+    </w:lvl>
+  </w:abstractNum>
   <w:abstractNum w:abstractNumId="990">
     <w:nsid w:val="0000A990"/>
     <w:multiLevelType w:val="multilevel"/>
@@ -893,6 +1704,114 @@
       </w:pPr>
     </w:lvl>
   </w:abstractNum>
+  <w:num w16cid:durableId="666442937" w:numId="1">
+    <w:abstractNumId w:val="1"/>
+  </w:num>
+  <w:num w16cid:durableId="611596762" w:numId="2">
+    <w:abstractNumId w:val="0"/>
+  </w:num>
+  <w:num w16cid:durableId="388962429" w:numId="3">
+    <w:abstractNumId w:val="0"/>
+  </w:num>
+  <w:num w16cid:durableId="1208103481" w:numId="4">
+    <w:abstractNumId w:val="0"/>
+  </w:num>
+  <w:num w16cid:durableId="2058387244" w:numId="5">
+    <w:abstractNumId w:val="0"/>
+  </w:num>
+  <w:num w16cid:durableId="571309507" w:numId="6">
+    <w:abstractNumId w:val="0"/>
+  </w:num>
+  <w:num w16cid:durableId="564293530" w:numId="7">
+    <w:abstractNumId w:val="0"/>
+  </w:num>
+  <w:num w16cid:durableId="1537962493" w:numId="8">
+    <w:abstractNumId w:val="0"/>
+  </w:num>
+  <w:num w16cid:durableId="1458573164" w:numId="9">
+    <w:abstractNumId w:val="0"/>
+  </w:num>
+  <w:num w16cid:durableId="2042437547" w:numId="10">
+    <w:abstractNumId w:val="0"/>
+  </w:num>
+  <w:num w16cid:durableId="2042438987" w:numId="11">
+    <w:abstractNumId w:val="0"/>
+  </w:num>
+  <w:num w16cid:durableId="477458780" w:numId="12">
+    <w:abstractNumId w:val="0"/>
+  </w:num>
+  <w:num w16cid:durableId="698898323" w:numId="13">
+    <w:abstractNumId w:val="0"/>
+  </w:num>
+  <w:num w16cid:durableId="424956732" w:numId="14">
+    <w:abstractNumId w:val="0"/>
+  </w:num>
+  <w:num w16cid:durableId="69932026" w:numId="15">
+    <w:abstractNumId w:val="0"/>
+  </w:num>
+  <w:num w16cid:durableId="1401829951" w:numId="16">
+    <w:abstractNumId w:val="3"/>
+    <w:lvlOverride w:ilvl="0">
+      <w:startOverride w:val="1"/>
+    </w:lvlOverride>
+    <w:lvlOverride w:ilvl="1">
+      <w:startOverride w:val="1"/>
+    </w:lvlOverride>
+    <w:lvlOverride w:ilvl="2">
+      <w:startOverride w:val="1"/>
+    </w:lvlOverride>
+    <w:lvlOverride w:ilvl="3">
+      <w:startOverride w:val="1"/>
+    </w:lvlOverride>
+    <w:lvlOverride w:ilvl="4">
+      <w:startOverride w:val="1"/>
+    </w:lvlOverride>
+    <w:lvlOverride w:ilvl="5">
+      <w:startOverride w:val="1"/>
+    </w:lvlOverride>
+    <w:lvlOverride w:ilvl="6">
+      <w:startOverride w:val="1"/>
+    </w:lvlOverride>
+    <w:lvlOverride w:ilvl="7">
+      <w:startOverride w:val="1"/>
+    </w:lvlOverride>
+    <w:lvlOverride w:ilvl="8">
+      <w:startOverride w:val="1"/>
+    </w:lvlOverride>
+  </w:num>
+  <w:num w16cid:durableId="1720593767" w:numId="17">
+    <w:abstractNumId w:val="0"/>
+  </w:num>
+  <w:num w16cid:durableId="293027331" w:numId="18">
+    <w:abstractNumId w:val="2"/>
+    <w:lvlOverride w:ilvl="0">
+      <w:startOverride w:val="7"/>
+    </w:lvlOverride>
+    <w:lvlOverride w:ilvl="1">
+      <w:startOverride w:val="7"/>
+    </w:lvlOverride>
+    <w:lvlOverride w:ilvl="2">
+      <w:startOverride w:val="7"/>
+    </w:lvlOverride>
+    <w:lvlOverride w:ilvl="3">
+      <w:startOverride w:val="7"/>
+    </w:lvlOverride>
+    <w:lvlOverride w:ilvl="4">
+      <w:startOverride w:val="7"/>
+    </w:lvlOverride>
+    <w:lvlOverride w:ilvl="5">
+      <w:startOverride w:val="7"/>
+    </w:lvlOverride>
+    <w:lvlOverride w:ilvl="6">
+      <w:startOverride w:val="7"/>
+    </w:lvlOverride>
+    <w:lvlOverride w:ilvl="7">
+      <w:startOverride w:val="7"/>
+    </w:lvlOverride>
+    <w:lvlOverride w:ilvl="8">
+      <w:startOverride w:val="7"/>
+    </w:lvlOverride>
+  </w:num>
   <w:num w:numId="1000">
     <w:abstractNumId w:val="990"/>
   </w:num>
@@ -900,14 +1819,15 @@
 </file>
 
 <file path=word/styles.xml><?xml version="1.0" encoding="utf-8"?>
-<w:styles xmlns:r="http://schemas.openxmlformats.org/officeDocument/2006/relationships" xmlns:w="http://schemas.openxmlformats.org/wordprocessingml/2006/main">
+<w:styles xmlns:mc="http://schemas.openxmlformats.org/markup-compatibility/2006" xmlns:r="http://schemas.openxmlformats.org/officeDocument/2006/relationships" xmlns:w="http://schemas.openxmlformats.org/wordprocessingml/2006/main" xmlns:w14="http://schemas.microsoft.com/office/word/2010/wordml" xmlns:w15="http://schemas.microsoft.com/office/word/2012/wordml" xmlns:w16="http://schemas.microsoft.com/office/word/2018/wordml" xmlns:w16cex="http://schemas.microsoft.com/office/word/2018/wordml/cex" xmlns:w16cid="http://schemas.microsoft.com/office/word/2016/wordml/cid" xmlns:w16du="http://schemas.microsoft.com/office/word/2023/wordml/word16du" xmlns:w16sdtdh="http://schemas.microsoft.com/office/word/2020/wordml/sdtdatahash" xmlns:w16sdtfl="http://schemas.microsoft.com/office/word/2024/wordml/sdtformatlock" xmlns:w16se="http://schemas.microsoft.com/office/word/2015/wordml/symex" mc:Ignorable="w14 w15 w16se w16cid w16 w16cex w16sdtdh w16sdtfl w16du">
   <w:docDefaults>
     <w:rPrDefault>
       <w:rPr>
-        <w:rFonts w:asciiTheme="minorHAnsi" w:cstheme="minorBidi" w:eastAsiaTheme="minorEastAsia" w:hAnsiTheme="minorHAnsi"/>
-        <w:sz w:val="24"/>
-        <w:szCs w:val="24"/>
-        <w:lang w:bidi="ar-SA" w:eastAsia="zh-CN" w:val="en-US"/>
+        <w:rFonts w:asciiTheme="minorHAnsi" w:cstheme="minorBidi" w:eastAsiaTheme="minorHAnsi" w:hAnsiTheme="minorHAnsi"/>
+        <w:color w:val="1A1A1A"/>
+        <w:sz w:val="22"/>
+        <w:szCs w:val="22"/>
+        <w:lang w:bidi="ar-SA" w:eastAsia="en-US" w:val="en-US"/>
       </w:rPr>
     </w:rPrDefault>
     <w:pPrDefault>
@@ -916,15 +1836,475 @@
       </w:pPr>
     </w:pPrDefault>
   </w:docDefaults>
-  <w:latentStyles w:count="276" w:defLockedState="0" w:defQFormat="0" w:defSemiHidden="0" w:defUIPriority="0" w:defUnhideWhenUsed="0"/>
+  <w:latentStyles w:count="376" w:defLockedState="0" w:defQFormat="0" w:defSemiHidden="0" w:defUIPriority="0" w:defUnhideWhenUsed="0">
+    <w:lsdException w:name="toc 1" w:uiPriority="39"/>
+    <w:lsdException w:name="toc 2" w:uiPriority="39"/>
+    <w:lsdException w:name="Hyperlink" w:uiPriority="99"/>
+    <w:lsdException w:name="Normal Table" w:semiHidden="1" w:unhideWhenUsed="1"/>
+    <w:lsdException w:name="Table Simple 1" w:semiHidden="1" w:unhideWhenUsed="1"/>
+    <w:lsdException w:name="Table Simple 2" w:semiHidden="1" w:unhideWhenUsed="1"/>
+    <w:lsdException w:name="Table Simple 3" w:semiHidden="1" w:unhideWhenUsed="1"/>
+    <w:lsdException w:name="Table Classic 1" w:semiHidden="1" w:unhideWhenUsed="1"/>
+    <w:lsdException w:name="Table Classic 2" w:semiHidden="1" w:unhideWhenUsed="1"/>
+    <w:lsdException w:name="Table Classic 3" w:semiHidden="1" w:unhideWhenUsed="1"/>
+    <w:lsdException w:name="Table Classic 4" w:semiHidden="1" w:unhideWhenUsed="1"/>
+    <w:lsdException w:name="Table Colorful 1" w:semiHidden="1" w:unhideWhenUsed="1"/>
+    <w:lsdException w:name="Table Colorful 2" w:semiHidden="1" w:unhideWhenUsed="1"/>
+    <w:lsdException w:name="Table Colorful 3" w:semiHidden="1" w:unhideWhenUsed="1"/>
+    <w:lsdException w:name="Table Columns 1" w:semiHidden="1" w:unhideWhenUsed="1"/>
+    <w:lsdException w:name="Table Columns 2" w:semiHidden="1" w:unhideWhenUsed="1"/>
+    <w:lsdException w:name="Table Columns 3" w:semiHidden="1" w:unhideWhenUsed="1"/>
+    <w:lsdException w:name="Table Columns 4" w:semiHidden="1" w:unhideWhenUsed="1"/>
+    <w:lsdException w:name="Table Columns 5" w:semiHidden="1" w:unhideWhenUsed="1"/>
+    <w:lsdException w:name="Table Grid 1" w:semiHidden="1" w:unhideWhenUsed="1"/>
+    <w:lsdException w:name="Table Grid 2" w:semiHidden="1" w:unhideWhenUsed="1"/>
+    <w:lsdException w:name="Table Grid 3" w:semiHidden="1" w:unhideWhenUsed="1"/>
+    <w:lsdException w:name="Table Grid 4" w:semiHidden="1" w:unhideWhenUsed="1"/>
+    <w:lsdException w:name="Table Grid 5" w:semiHidden="1" w:unhideWhenUsed="1"/>
+    <w:lsdException w:name="Table Grid 6" w:semiHidden="1" w:unhideWhenUsed="1"/>
+    <w:lsdException w:name="Table Grid 7" w:semiHidden="1" w:unhideWhenUsed="1"/>
+    <w:lsdException w:name="Table Grid 8" w:semiHidden="1" w:unhideWhenUsed="1"/>
+    <w:lsdException w:name="Table List 1" w:semiHidden="1" w:unhideWhenUsed="1"/>
+    <w:lsdException w:name="Table List 2" w:semiHidden="1" w:unhideWhenUsed="1"/>
+    <w:lsdException w:name="Table List 3" w:semiHidden="1" w:unhideWhenUsed="1"/>
+    <w:lsdException w:name="Table List 4" w:semiHidden="1" w:unhideWhenUsed="1"/>
+    <w:lsdException w:name="Table List 5" w:semiHidden="1" w:unhideWhenUsed="1"/>
+    <w:lsdException w:name="Table List 6" w:semiHidden="1" w:unhideWhenUsed="1"/>
+    <w:lsdException w:name="Table List 7" w:semiHidden="1" w:unhideWhenUsed="1"/>
+    <w:lsdException w:name="Table List 8" w:semiHidden="1" w:unhideWhenUsed="1"/>
+    <w:lsdException w:name="Table 3D effects 1" w:semiHidden="1" w:unhideWhenUsed="1"/>
+    <w:lsdException w:name="Table 3D effects 2" w:semiHidden="1" w:unhideWhenUsed="1"/>
+    <w:lsdException w:name="Table 3D effects 3" w:semiHidden="1" w:unhideWhenUsed="1"/>
+    <w:lsdException w:name="Table Contemporary" w:semiHidden="1" w:unhideWhenUsed="1"/>
+    <w:lsdException w:name="Table Elegant" w:semiHidden="1" w:unhideWhenUsed="1"/>
+    <w:lsdException w:name="Table Professional" w:semiHidden="1" w:unhideWhenUsed="1"/>
+    <w:lsdException w:name="Table Subtle 1" w:semiHidden="1" w:unhideWhenUsed="1"/>
+    <w:lsdException w:name="Table Subtle 2" w:semiHidden="1" w:unhideWhenUsed="1"/>
+    <w:lsdException w:name="Table Web 1" w:semiHidden="1" w:unhideWhenUsed="1"/>
+    <w:lsdException w:name="Table Web 2" w:semiHidden="1" w:unhideWhenUsed="1"/>
+    <w:lsdException w:name="Table Web 3" w:semiHidden="1" w:unhideWhenUsed="1"/>
+    <w:lsdException w:name="Table Theme" w:semiHidden="1" w:unhideWhenUsed="1"/>
+    <w:lsdException w:name="Light Shading"/>
+    <w:lsdException w:name="Light List"/>
+    <w:lsdException w:name="Light Grid"/>
+    <w:lsdException w:name="Medium Shading 1"/>
+    <w:lsdException w:name="Medium Shading 2"/>
+    <w:lsdException w:name="Medium List 1"/>
+    <w:lsdException w:name="Medium List 2"/>
+    <w:lsdException w:name="Medium Grid 1"/>
+    <w:lsdException w:name="Medium Grid 2"/>
+    <w:lsdException w:name="Medium Grid 3"/>
+    <w:lsdException w:name="Dark List"/>
+    <w:lsdException w:name="Colorful Shading"/>
+    <w:lsdException w:name="Colorful List"/>
+    <w:lsdException w:name="Colorful Grid"/>
+    <w:lsdException w:name="Light Shading Accent 1"/>
+    <w:lsdException w:name="Light List Accent 1"/>
+    <w:lsdException w:name="Light Grid Accent 1"/>
+    <w:lsdException w:name="Medium Shading 1 Accent 1"/>
+    <w:lsdException w:name="Medium Shading 2 Accent 1"/>
+    <w:lsdException w:name="Medium List 1 Accent 1"/>
+    <w:lsdException w:name="Medium List 2 Accent 1"/>
+    <w:lsdException w:name="Medium Grid 1 Accent 1"/>
+    <w:lsdException w:name="Medium Grid 2 Accent 1"/>
+    <w:lsdException w:name="Medium Grid 3 Accent 1"/>
+    <w:lsdException w:name="Dark List Accent 1"/>
+    <w:lsdException w:name="Colorful Shading Accent 1"/>
+    <w:lsdException w:name="Colorful List Accent 1"/>
+    <w:lsdException w:name="Colorful Grid Accent 1"/>
+    <w:lsdException w:name="Light Shading Accent 2"/>
+    <w:lsdException w:name="Light List Accent 2"/>
+    <w:lsdException w:name="Light Grid Accent 2"/>
+    <w:lsdException w:name="Medium Shading 1 Accent 2"/>
+    <w:lsdException w:name="Medium Shading 2 Accent 2"/>
+    <w:lsdException w:name="Medium List 1 Accent 2"/>
+    <w:lsdException w:name="Medium List 2 Accent 2"/>
+    <w:lsdException w:name="Medium Grid 1 Accent 2"/>
+    <w:lsdException w:name="Medium Grid 2 Accent 2"/>
+    <w:lsdException w:name="Medium Grid 3 Accent 2"/>
+    <w:lsdException w:name="Dark List Accent 2"/>
+    <w:lsdException w:name="Colorful Shading Accent 2"/>
+    <w:lsdException w:name="Colorful List Accent 2"/>
+    <w:lsdException w:name="Colorful Grid Accent 2"/>
+    <w:lsdException w:name="Light Shading Accent 3"/>
+    <w:lsdException w:name="Light List Accent 3"/>
+    <w:lsdException w:name="Light Grid Accent 3"/>
+    <w:lsdException w:name="Medium Shading 1 Accent 3"/>
+    <w:lsdException w:name="Medium Shading 2 Accent 3"/>
+    <w:lsdException w:name="Medium List 1 Accent 3"/>
+    <w:lsdException w:name="Medium List 2 Accent 3"/>
+    <w:lsdException w:name="Medium Grid 1 Accent 3"/>
+    <w:lsdException w:name="Medium Grid 2 Accent 3"/>
+    <w:lsdException w:name="Medium Grid 3 Accent 3"/>
+    <w:lsdException w:name="Dark List Accent 3"/>
+    <w:lsdException w:name="Colorful Shading Accent 3"/>
+    <w:lsdException w:name="Colorful List Accent 3"/>
+    <w:lsdException w:name="Colorful Grid Accent 3"/>
+    <w:lsdException w:name="Light Shading Accent 4"/>
+    <w:lsdException w:name="Light List Accent 4"/>
+    <w:lsdException w:name="Light Grid Accent 4"/>
+    <w:lsdException w:name="Medium Shading 1 Accent 4"/>
+    <w:lsdException w:name="Medium Shading 2 Accent 4"/>
+    <w:lsdException w:name="Medium List 1 Accent 4"/>
+    <w:lsdException w:name="Medium List 2 Accent 4"/>
+    <w:lsdException w:name="Medium Grid 1 Accent 4"/>
+    <w:lsdException w:name="Medium Grid 2 Accent 4"/>
+    <w:lsdException w:name="Medium Grid 3 Accent 4"/>
+    <w:lsdException w:name="Dark List Accent 4"/>
+    <w:lsdException w:name="Colorful Shading Accent 4"/>
+    <w:lsdException w:name="Colorful List Accent 4"/>
+    <w:lsdException w:name="Colorful Grid Accent 4"/>
+    <w:lsdException w:name="Light Shading Accent 5"/>
+    <w:lsdException w:name="Light List Accent 5"/>
+    <w:lsdException w:name="Light Grid Accent 5"/>
+    <w:lsdException w:name="Medium Shading 1 Accent 5"/>
+    <w:lsdException w:name="Medium Shading 2 Accent 5"/>
+    <w:lsdException w:name="Medium List 1 Accent 5"/>
+    <w:lsdException w:name="Medium List 2 Accent 5"/>
+    <w:lsdException w:name="Medium Grid 1 Accent 5"/>
+    <w:lsdException w:name="Medium Grid 2 Accent 5"/>
+    <w:lsdException w:name="Medium Grid 3 Accent 5"/>
+    <w:lsdException w:name="Dark List Accent 5"/>
+    <w:lsdException w:name="Colorful Shading Accent 5"/>
+    <w:lsdException w:name="Colorful List Accent 5"/>
+    <w:lsdException w:name="Colorful Grid Accent 5"/>
+    <w:lsdException w:name="Light Shading Accent 6"/>
+    <w:lsdException w:name="Light List Accent 6"/>
+    <w:lsdException w:name="Light Grid Accent 6"/>
+    <w:lsdException w:name="Medium Shading 1 Accent 6"/>
+    <w:lsdException w:name="Medium Shading 2 Accent 6"/>
+    <w:lsdException w:name="Medium List 1 Accent 6"/>
+    <w:lsdException w:name="Medium List 2 Accent 6"/>
+    <w:lsdException w:name="Medium Grid 1 Accent 6"/>
+    <w:lsdException w:name="Medium Grid 2 Accent 6"/>
+    <w:lsdException w:name="Medium Grid 3 Accent 6"/>
+    <w:lsdException w:name="Dark List Accent 6"/>
+    <w:lsdException w:name="Colorful Shading Accent 6"/>
+    <w:lsdException w:name="Colorful List Accent 6"/>
+    <w:lsdException w:name="Colorful Grid Accent 6"/>
+    <w:lsdException w:name="Grid Table 4" w:uiPriority="49"/>
+    <w:lsdException w:name="Grid Table 5 Dark" w:uiPriority="50"/>
+    <w:lsdException w:name="Grid Table 6 Colorful" w:uiPriority="51"/>
+    <w:lsdException w:name="Grid Table 7 Colorful" w:uiPriority="52"/>
+    <w:lsdException w:name="Grid Table 1 Light Accent 1" w:uiPriority="46"/>
+    <w:lsdException w:name="Grid Table 2 Accent 1" w:uiPriority="47"/>
+    <w:lsdException w:name="Grid Table 3 Accent 1" w:uiPriority="48"/>
+    <w:lsdException w:name="Grid Table 4 Accent 1" w:uiPriority="49"/>
+    <w:lsdException w:name="Grid Table 5 Dark Accent 1" w:uiPriority="50"/>
+    <w:lsdException w:name="Grid Table 6 Colorful Accent 1" w:uiPriority="51"/>
+    <w:lsdException w:name="Grid Table 7 Colorful Accent 1" w:uiPriority="52"/>
+    <w:lsdException w:name="Grid Table 1 Light Accent 2" w:uiPriority="46"/>
+    <w:lsdException w:name="Grid Table 2 Accent 2" w:uiPriority="47"/>
+    <w:lsdException w:name="Grid Table 3 Accent 2" w:uiPriority="48"/>
+    <w:lsdException w:name="Grid Table 4 Accent 2" w:uiPriority="49"/>
+    <w:lsdException w:name="Grid Table 5 Dark Accent 2" w:uiPriority="50"/>
+    <w:lsdException w:name="Grid Table 6 Colorful Accent 2" w:uiPriority="51"/>
+    <w:lsdException w:name="Grid Table 7 Colorful Accent 2" w:uiPriority="52"/>
+    <w:lsdException w:name="Grid Table 1 Light Accent 3" w:uiPriority="46"/>
+    <w:lsdException w:name="Grid Table 2 Accent 3" w:uiPriority="47"/>
+    <w:lsdException w:name="Grid Table 3 Accent 3" w:uiPriority="48"/>
+    <w:lsdException w:name="Grid Table 4 Accent 3" w:uiPriority="49"/>
+    <w:lsdException w:name="Grid Table 5 Dark Accent 3" w:uiPriority="50"/>
+    <w:lsdException w:name="Grid Table 6 Colorful Accent 3" w:uiPriority="51"/>
+    <w:lsdException w:name="Grid Table 7 Colorful Accent 3" w:uiPriority="52"/>
+    <w:lsdException w:name="Grid Table 1 Light Accent 4" w:uiPriority="46"/>
+    <w:lsdException w:name="Grid Table 2 Accent 4" w:uiPriority="47"/>
+    <w:lsdException w:name="Grid Table 3 Accent 4" w:uiPriority="48"/>
+    <w:lsdException w:name="Grid Table 4 Accent 4" w:uiPriority="49"/>
+    <w:lsdException w:name="Grid Table 5 Dark Accent 4" w:uiPriority="50"/>
+    <w:lsdException w:name="Grid Table 6 Colorful Accent 4" w:uiPriority="51"/>
+    <w:lsdException w:name="Grid Table 7 Colorful Accent 4" w:uiPriority="52"/>
+    <w:lsdException w:name="Grid Table 1 Light Accent 5" w:uiPriority="46"/>
+    <w:lsdException w:name="Grid Table 2 Accent 5" w:uiPriority="47"/>
+    <w:lsdException w:name="Grid Table 3 Accent 5" w:uiPriority="48"/>
+    <w:lsdException w:name="Grid Table 4 Accent 5" w:uiPriority="49"/>
+    <w:lsdException w:name="Grid Table 5 Dark Accent 5" w:uiPriority="50"/>
+    <w:lsdException w:name="Grid Table 6 Colorful Accent 5" w:uiPriority="51"/>
+    <w:lsdException w:name="Grid Table 7 Colorful Accent 5" w:uiPriority="52"/>
+    <w:lsdException w:name="Grid Table 1 Light Accent 6" w:uiPriority="46"/>
+    <w:lsdException w:name="Grid Table 2 Accent 6" w:uiPriority="47"/>
+    <w:lsdException w:name="Grid Table 3 Accent 6" w:uiPriority="48"/>
+    <w:lsdException w:name="Grid Table 4 Accent 6" w:uiPriority="49"/>
+    <w:lsdException w:name="Grid Table 5 Dark Accent 6" w:uiPriority="50"/>
+    <w:lsdException w:name="Grid Table 6 Colorful Accent 6" w:uiPriority="51"/>
+    <w:lsdException w:name="Grid Table 7 Colorful Accent 6" w:uiPriority="52"/>
+    <w:lsdException w:name="List Table 1 Light" w:uiPriority="46"/>
+    <w:lsdException w:name="List Table 2" w:uiPriority="47"/>
+    <w:lsdException w:name="List Table 3" w:uiPriority="48"/>
+    <w:lsdException w:name="List Table 4" w:uiPriority="49"/>
+    <w:lsdException w:name="List Table 5 Dark" w:uiPriority="50"/>
+    <w:lsdException w:name="List Table 6 Colorful" w:uiPriority="51"/>
+    <w:lsdException w:name="List Table 7 Colorful" w:uiPriority="52"/>
+    <w:lsdException w:name="List Table 1 Light Accent 1" w:uiPriority="46"/>
+    <w:lsdException w:name="List Table 2 Accent 1" w:uiPriority="47"/>
+    <w:lsdException w:name="List Table 3 Accent 1" w:uiPriority="48"/>
+    <w:lsdException w:name="List Table 4 Accent 1" w:uiPriority="49"/>
+    <w:lsdException w:name="List Table 5 Dark Accent 1" w:uiPriority="50"/>
+    <w:lsdException w:name="List Table 6 Colorful Accent 1" w:uiPriority="51"/>
+    <w:lsdException w:name="List Table 7 Colorful Accent 1" w:uiPriority="52"/>
+    <w:lsdException w:name="List Table 1 Light Accent 2" w:uiPriority="46"/>
+    <w:lsdException w:name="List Table 2 Accent 2" w:uiPriority="47"/>
+    <w:lsdException w:name="List Table 3 Accent 2" w:uiPriority="48"/>
+    <w:lsdException w:name="List Table 4 Accent 2" w:uiPriority="49"/>
+    <w:lsdException w:name="List Table 5 Dark Accent 2" w:uiPriority="50"/>
+    <w:lsdException w:name="List Table 6 Colorful Accent 2" w:uiPriority="51"/>
+    <w:lsdException w:name="List Table 7 Colorful Accent 2" w:uiPriority="52"/>
+    <w:lsdException w:name="List Table 1 Light Accent 3" w:uiPriority="46"/>
+    <w:lsdException w:name="List Table 2 Accent 3" w:uiPriority="47"/>
+    <w:lsdException w:name="List Table 3 Accent 3" w:uiPriority="48"/>
+    <w:lsdException w:name="List Table 4 Accent 3" w:uiPriority="49"/>
+    <w:lsdException w:name="List Table 5 Dark Accent 3" w:uiPriority="50"/>
+    <w:lsdException w:name="List Table 6 Colorful Accent 3" w:uiPriority="51"/>
+    <w:lsdException w:name="List Table 7 Colorful Accent 3" w:uiPriority="52"/>
+    <w:lsdException w:name="List Table 1 Light Accent 4" w:uiPriority="46"/>
+    <w:lsdException w:name="List Table 2 Accent 4" w:uiPriority="47"/>
+    <w:lsdException w:name="List Table 3 Accent 4" w:uiPriority="48"/>
+    <w:lsdException w:name="List Table 4 Accent 4" w:uiPriority="49"/>
+    <w:lsdException w:name="List Table 5 Dark Accent 4" w:uiPriority="50"/>
+    <w:lsdException w:name="List Table 6 Colorful Accent 4" w:uiPriority="51"/>
+    <w:lsdException w:name="List Table 7 Colorful Accent 4" w:uiPriority="52"/>
+    <w:lsdException w:name="List Table 1 Light Accent 5" w:uiPriority="46"/>
+    <w:lsdException w:name="List Table 2 Accent 5" w:uiPriority="47"/>
+    <w:lsdException w:name="List Table 3 Accent 5" w:uiPriority="48"/>
+    <w:lsdException w:name="List Table 4 Accent 5" w:uiPriority="49"/>
+    <w:lsdException w:name="List Table 5 Dark Accent 5" w:uiPriority="50"/>
+    <w:lsdException w:name="List Table 6 Colorful Accent 5" w:uiPriority="51"/>
+    <w:lsdException w:name="List Table 7 Colorful Accent 5" w:uiPriority="52"/>
+    <w:lsdException w:name="List Table 1 Light Accent 6" w:uiPriority="46"/>
+    <w:lsdException w:name="List Table 2 Accent 6" w:uiPriority="47"/>
+    <w:lsdException w:name="List Table 3 Accent 6" w:uiPriority="48"/>
+    <w:lsdException w:name="List Table 4 Accent 6" w:uiPriority="49"/>
+    <w:lsdException w:name="List Table 5 Dark Accent 6" w:uiPriority="50"/>
+    <w:lsdException w:name="List Table 6 Colorful Accent 6" w:uiPriority="51"/>
+    <w:lsdException w:name="List Table 7 Colorful Accent 6" w:uiPriority="52"/>
+    <w:lsdException w:name="Mention" w:semiHidden="1" w:uiPriority="99" w:unhideWhenUsed="1"/>
+    <w:lsdException w:name="Smart Hyperlink" w:semiHidden="1" w:uiPriority="99" w:unhideWhenUsed="1"/>
+    <w:lsdException w:name="Hashtag" w:semiHidden="1" w:uiPriority="99" w:unhideWhenUsed="1"/>
+    <w:lsdException w:name="Unresolved Mention" w:semiHidden="1" w:uiPriority="99" w:unhideWhenUsed="1"/>
+    <w:lsdException w:name="Smart Link" w:semiHidden="1" w:uiPriority="99" w:unhideWhenUsed="1"/>
+  </w:latentStyles>
   <w:style w:default="1" w:styleId="Normal" w:type="paragraph">
     <w:name w:val="Normal"/>
     <w:qFormat/>
   </w:style>
+  <w:style w:styleId="Heading1" w:type="paragraph">
+    <w:name w:val="heading 1"/>
+    <w:basedOn w:val="Normal"/>
+    <w:next w:val="BodyText"/>
+    <w:uiPriority w:val="9"/>
+    <w:qFormat/>
+    <w:pPr>
+      <w:keepNext/>
+      <w:keepLines/>
+      <w:spacing w:after="0" w:before="480"/>
+      <w:outlineLvl w:val="0"/>
+    </w:pPr>
+    <w:rPr>
+      <w:rFonts w:asciiTheme="majorHAnsi" w:cstheme="majorBidi" w:eastAsiaTheme="majorEastAsia" w:hAnsiTheme="majorHAnsi"/>
+      <w:b/>
+      <w:bCs/>
+      <w:color w:val="E64C38"/>
+      <w:sz w:val="32"/>
+      <w:szCs w:val="32"/>
+    </w:rPr>
+  </w:style>
+  <w:style w:styleId="Heading2" w:type="paragraph">
+    <w:name w:val="heading 2"/>
+    <w:basedOn w:val="Normal"/>
+    <w:next w:val="BodyText"/>
+    <w:uiPriority w:val="9"/>
+    <w:unhideWhenUsed/>
+    <w:qFormat/>
+    <w:pPr>
+      <w:keepNext/>
+      <w:keepLines/>
+      <w:spacing w:after="0" w:before="200"/>
+      <w:outlineLvl w:val="1"/>
+    </w:pPr>
+    <w:rPr>
+      <w:rFonts w:asciiTheme="majorHAnsi" w:cstheme="majorBidi" w:eastAsiaTheme="majorEastAsia" w:hAnsiTheme="majorHAnsi"/>
+      <w:b/>
+      <w:bCs/>
+      <w:color w:val="E64C38"/>
+      <w:sz w:val="28"/>
+      <w:szCs w:val="28"/>
+    </w:rPr>
+  </w:style>
+  <w:style w:styleId="Heading3" w:type="paragraph">
+    <w:name w:val="heading 3"/>
+    <w:basedOn w:val="Normal"/>
+    <w:next w:val="BodyText"/>
+    <w:uiPriority w:val="9"/>
+    <w:unhideWhenUsed/>
+    <w:qFormat/>
+    <w:pPr>
+      <w:keepNext/>
+      <w:keepLines/>
+      <w:spacing w:after="0" w:before="200"/>
+      <w:outlineLvl w:val="2"/>
+    </w:pPr>
+    <w:rPr>
+      <w:rFonts w:asciiTheme="majorHAnsi" w:cstheme="majorBidi" w:eastAsiaTheme="majorEastAsia" w:hAnsiTheme="majorHAnsi"/>
+      <w:b/>
+      <w:bCs/>
+      <w:color w:val="E64C38"/>
+      <w:sz w:val="24"/>
+      <w:szCs w:val="24"/>
+    </w:rPr>
+  </w:style>
+  <w:style w:styleId="Heading4" w:type="paragraph">
+    <w:name w:val="heading 4"/>
+    <w:basedOn w:val="Normal"/>
+    <w:next w:val="BodyText"/>
+    <w:uiPriority w:val="9"/>
+    <w:unhideWhenUsed/>
+    <w:qFormat/>
+    <w:pPr>
+      <w:keepNext/>
+      <w:keepLines/>
+      <w:spacing w:after="0" w:before="200"/>
+      <w:outlineLvl w:val="3"/>
+    </w:pPr>
+    <w:rPr>
+      <w:rFonts w:asciiTheme="majorHAnsi" w:cstheme="majorBidi" w:eastAsiaTheme="majorEastAsia" w:hAnsiTheme="majorHAnsi"/>
+      <w:bCs/>
+      <w:i/>
+      <w:color w:val="E64C38"/>
+      <w:sz w:val="24"/>
+      <w:szCs w:val="24"/>
+    </w:rPr>
+  </w:style>
+  <w:style w:styleId="Heading5" w:type="paragraph">
+    <w:name w:val="heading 5"/>
+    <w:basedOn w:val="Normal"/>
+    <w:next w:val="BodyText"/>
+    <w:uiPriority w:val="9"/>
+    <w:unhideWhenUsed/>
+    <w:qFormat/>
+    <w:pPr>
+      <w:keepNext/>
+      <w:keepLines/>
+      <w:spacing w:after="0" w:before="200"/>
+      <w:outlineLvl w:val="4"/>
+    </w:pPr>
+    <w:rPr>
+      <w:rFonts w:asciiTheme="majorHAnsi" w:cstheme="majorBidi" w:eastAsiaTheme="majorEastAsia" w:hAnsiTheme="majorHAnsi"/>
+      <w:iCs/>
+      <w:color w:val="E64C38"/>
+      <w:sz w:val="24"/>
+      <w:szCs w:val="24"/>
+    </w:rPr>
+  </w:style>
+  <w:style w:styleId="Heading6" w:type="paragraph">
+    <w:name w:val="heading 6"/>
+    <w:basedOn w:val="Normal"/>
+    <w:next w:val="BodyText"/>
+    <w:uiPriority w:val="9"/>
+    <w:unhideWhenUsed/>
+    <w:qFormat/>
+    <w:pPr>
+      <w:keepNext/>
+      <w:keepLines/>
+      <w:spacing w:after="0" w:before="200"/>
+      <w:outlineLvl w:val="5"/>
+    </w:pPr>
+    <w:rPr>
+      <w:rFonts w:asciiTheme="majorHAnsi" w:cstheme="majorBidi" w:eastAsiaTheme="majorEastAsia" w:hAnsiTheme="majorHAnsi"/>
+      <w:color w:val="E64C38"/>
+      <w:sz w:val="24"/>
+      <w:szCs w:val="24"/>
+    </w:rPr>
+  </w:style>
+  <w:style w:styleId="Heading7" w:type="paragraph">
+    <w:name w:val="heading 7"/>
+    <w:basedOn w:val="Normal"/>
+    <w:next w:val="BodyText"/>
+    <w:uiPriority w:val="9"/>
+    <w:unhideWhenUsed/>
+    <w:qFormat/>
+    <w:pPr>
+      <w:keepNext/>
+      <w:keepLines/>
+      <w:spacing w:after="0" w:before="200"/>
+      <w:outlineLvl w:val="6"/>
+    </w:pPr>
+    <w:rPr>
+      <w:rFonts w:asciiTheme="majorHAnsi" w:cstheme="majorBidi" w:eastAsiaTheme="majorEastAsia" w:hAnsiTheme="majorHAnsi"/>
+      <w:color w:val="E64C38"/>
+      <w:sz w:val="24"/>
+      <w:szCs w:val="24"/>
+    </w:rPr>
+  </w:style>
+  <w:style w:styleId="Heading8" w:type="paragraph">
+    <w:name w:val="heading 8"/>
+    <w:basedOn w:val="Normal"/>
+    <w:next w:val="BodyText"/>
+    <w:uiPriority w:val="9"/>
+    <w:unhideWhenUsed/>
+    <w:qFormat/>
+    <w:pPr>
+      <w:keepNext/>
+      <w:keepLines/>
+      <w:spacing w:after="0" w:before="200"/>
+      <w:outlineLvl w:val="7"/>
+    </w:pPr>
+    <w:rPr>
+      <w:rFonts w:asciiTheme="majorHAnsi" w:cstheme="majorBidi" w:eastAsiaTheme="majorEastAsia" w:hAnsiTheme="majorHAnsi"/>
+      <w:color w:val="E64C38"/>
+      <w:sz w:val="24"/>
+      <w:szCs w:val="24"/>
+    </w:rPr>
+  </w:style>
+  <w:style w:styleId="Heading9" w:type="paragraph">
+    <w:name w:val="heading 9"/>
+    <w:basedOn w:val="Normal"/>
+    <w:next w:val="BodyText"/>
+    <w:uiPriority w:val="9"/>
+    <w:unhideWhenUsed/>
+    <w:qFormat/>
+    <w:pPr>
+      <w:keepNext/>
+      <w:keepLines/>
+      <w:spacing w:after="0" w:before="200"/>
+      <w:outlineLvl w:val="8"/>
+    </w:pPr>
+    <w:rPr>
+      <w:rFonts w:asciiTheme="majorHAnsi" w:cstheme="majorBidi" w:eastAsiaTheme="majorEastAsia" w:hAnsiTheme="majorHAnsi"/>
+      <w:color w:val="E64C38"/>
+      <w:sz w:val="24"/>
+      <w:szCs w:val="24"/>
+    </w:rPr>
+  </w:style>
+  <w:style w:default="1" w:styleId="DefaultParagraphFont" w:type="character">
+    <w:name w:val="Default Paragraph Font"/>
+    <w:uiPriority w:val="1"/>
+    <w:semiHidden/>
+    <w:unhideWhenUsed/>
+  </w:style>
+  <w:style w:default="1" w:styleId="TableNormal" w:type="table">
+    <w:name w:val="Normal Table"/>
+    <w:uiPriority w:val="99"/>
+    <w:semiHidden/>
+    <w:unhideWhenUsed/>
+    <w:tblPr>
+      <w:tblInd w:type="dxa" w:w="0"/>
+      <w:tblCellMar>
+        <w:top w:type="dxa" w:w="0"/>
+        <w:left w:type="dxa" w:w="108"/>
+        <w:bottom w:type="dxa" w:w="0"/>
+        <w:right w:type="dxa" w:w="108"/>
+      </w:tblCellMar>
+    </w:tblPr>
+  </w:style>
+  <w:style w:default="1" w:styleId="NoList" w:type="numbering">
+    <w:name w:val="No List"/>
+    <w:uiPriority w:val="99"/>
+    <w:semiHidden/>
+    <w:unhideWhenUsed/>
+  </w:style>
   <w:style w:styleId="BodyText" w:type="paragraph">
     <w:name w:val="Body Text"/>
     <w:basedOn w:val="Normal"/>
-    <w:link w:val="BodyTextChar"/>
     <w:qFormat/>
     <w:pPr>
       <w:spacing w:after="180" w:before="180"/>
@@ -948,111 +2328,52 @@
     <w:name w:val="Title"/>
     <w:basedOn w:val="Normal"/>
     <w:next w:val="BodyText"/>
-    <w:link w:val="TitleChar"/>
-    <w:uiPriority w:val="10"/>
     <w:qFormat/>
-    <w:rsid w:val="00A10FD9"/>
     <w:pPr>
-      <w:spacing w:after="80" w:line="240" w:lineRule="auto"/>
-      <w:contextualSpacing/>
+      <w:keepNext/>
+      <w:keepLines/>
+      <w:spacing w:after="240" w:before="480"/>
       <w:jc w:val="center"/>
     </w:pPr>
     <w:rPr>
-      <w:rFonts w:asciiTheme="majorHAnsi" w:cstheme="majorBidi" w:eastAsiaTheme="majorEastAsia" w:hAnsiTheme="majorHAnsi"/>
-      <w:sz w:val="56"/>
-      <w:szCs w:val="56"/>
-    </w:rPr>
-  </w:style>
-  <w:style w:customStyle="1" w:styleId="TitleChar" w:type="character">
-    <w:name w:val="Title Char"/>
-    <w:basedOn w:val="DefaultParagraphFont"/>
-    <w:link w:val="Title"/>
-    <w:uiPriority w:val="10"/>
-    <w:rsid w:val="00A10FD9"/>
-    <w:rPr>
-      <w:rFonts w:asciiTheme="majorHAnsi" w:cstheme="majorBidi" w:eastAsiaTheme="majorEastAsia" w:hAnsiTheme="majorHAnsi"/>
-      <w:sz w:val="56"/>
-      <w:szCs w:val="56"/>
+      <w:b/>
+      <w:color w:val="E64C38"/>
+      <w:sz w:val="52"/>
+      <w:szCs w:val="52"/>
     </w:rPr>
   </w:style>
   <w:style w:styleId="Subtitle" w:type="paragraph">
     <w:name w:val="Subtitle"/>
     <w:basedOn w:val="Title"/>
     <w:next w:val="BodyText"/>
-    <w:link w:val="SubtitleChar"/>
-    <w:uiPriority w:val="11"/>
     <w:qFormat/>
-    <w:rsid w:val="00A10FD9"/>
     <w:pPr>
-      <w:numPr>
-        <w:ilvl w:val="1"/>
-      </w:numPr>
+      <w:spacing w:before="240"/>
     </w:pPr>
     <w:rPr>
-      <w:rFonts w:cstheme="majorBidi" w:eastAsiaTheme="majorEastAsia"/>
-      <w:spacing w:val="15"/>
-      <w:sz w:val="28"/>
-      <w:szCs w:val="28"/>
-    </w:rPr>
-  </w:style>
-  <w:style w:customStyle="1" w:styleId="SubtitleChar" w:type="character">
-    <w:name w:val="Subtitle Char"/>
-    <w:basedOn w:val="DefaultParagraphFont"/>
-    <w:link w:val="Subtitle"/>
-    <w:uiPriority w:val="11"/>
-    <w:rsid w:val="00A10FD9"/>
-    <w:rPr>
-      <w:rFonts w:cstheme="majorBidi" w:eastAsiaTheme="majorEastAsia"/>
-      <w:color w:themeColor="text1" w:themeTint="A6" w:val="595959"/>
-      <w:spacing w:val="15"/>
-      <w:sz w:val="28"/>
-      <w:szCs w:val="28"/>
+      <w:sz w:val="30"/>
+      <w:szCs w:val="30"/>
     </w:rPr>
   </w:style>
   <w:style w:customStyle="1" w:styleId="Author" w:type="paragraph">
     <w:name w:val="Author"/>
-    <w:basedOn w:val="Title"/>
     <w:next w:val="BodyText"/>
     <w:qFormat/>
     <w:pPr>
       <w:keepNext/>
       <w:keepLines/>
+      <w:jc w:val="center"/>
     </w:pPr>
-    <w:rPr>
-      <w:sz w:val="24"/>
-      <w:szCs w:val="24"/>
-    </w:rPr>
   </w:style>
   <w:style w:styleId="Date" w:type="paragraph">
     <w:name w:val="Date"/>
-    <w:basedOn w:val="Title"/>
     <w:next w:val="BodyText"/>
     <w:qFormat/>
     <w:pPr>
       <w:keepNext/>
       <w:keepLines/>
-    </w:pPr>
-    <w:rPr>
-      <w:sz w:val="24"/>
-      <w:szCs w:val="24"/>
-    </w:rPr>
-  </w:style>
-  <w:style w:customStyle="1" w:styleId="AbstractTitle" w:type="paragraph">
-    <w:name w:val="Abstract Title"/>
-    <w:basedOn w:val="Normal"/>
-    <w:next w:val="Abstract"/>
-    <w:qFormat/>
-    <w:pPr>
-      <w:keepNext/>
-      <w:keepLines/>
-      <w:spacing w:after="0" w:before="300"/>
       <w:jc w:val="center"/>
     </w:pPr>
-    <w:rPr>
-      <w:b/>
-      <w:sz w:val="20"/>
-      <w:szCs w:val="20"/>
-    </w:rPr>
   </w:style>
   <w:style w:customStyle="1" w:styleId="Abstract" w:type="paragraph">
     <w:name w:val="Abstract"/>
@@ -1062,7 +2383,7 @@
     <w:pPr>
       <w:keepNext/>
       <w:keepLines/>
-      <w:spacing w:after="300" w:before="100"/>
+      <w:spacing w:after="300" w:before="300"/>
     </w:pPr>
     <w:rPr>
       <w:sz w:val="20"/>
@@ -1072,328 +2393,7 @@
   <w:style w:styleId="Bibliography" w:type="paragraph">
     <w:name w:val="Bibliography"/>
     <w:basedOn w:val="Normal"/>
-    <w:next w:val="Bibliography"/>
     <w:qFormat/>
-    <w:pPr/>
-    <w:rPr/>
-  </w:style>
-  <w:style w:styleId="Heading1" w:type="paragraph">
-    <w:name w:val="heading 1"/>
-    <w:basedOn w:val="Normal"/>
-    <w:next w:val="BodyText"/>
-    <w:link w:val="Heading1Char"/>
-    <w:uiPriority w:val="9"/>
-    <w:qFormat/>
-    <w:rsid w:val="00A10FD9"/>
-    <w:pPr>
-      <w:keepNext/>
-      <w:keepLines/>
-      <w:spacing w:after="80" w:before="360"/>
-      <w:outlineLvl w:val="0"/>
-    </w:pPr>
-    <w:rPr>
-      <w:rFonts w:asciiTheme="majorHAnsi" w:cstheme="majorBidi" w:eastAsiaTheme="majorEastAsia" w:hAnsiTheme="majorHAnsi"/>
-      <w:color w:themeColor="accent1" w:themeShade="BF" w:val="0F4761"/>
-      <w:sz w:val="40"/>
-      <w:szCs w:val="40"/>
-    </w:rPr>
-  </w:style>
-  <w:style w:styleId="Heading2" w:type="paragraph">
-    <w:name w:val="heading 2"/>
-    <w:basedOn w:val="Normal"/>
-    <w:next w:val="BodyText"/>
-    <w:link w:val="Heading2Char"/>
-    <w:uiPriority w:val="9"/>
-    <w:semiHidden/>
-    <w:unhideWhenUsed/>
-    <w:qFormat/>
-    <w:rsid w:val="00A10FD9"/>
-    <w:pPr>
-      <w:keepNext/>
-      <w:keepLines/>
-      <w:spacing w:after="80" w:before="160"/>
-      <w:outlineLvl w:val="1"/>
-    </w:pPr>
-    <w:rPr>
-      <w:rFonts w:asciiTheme="majorHAnsi" w:cstheme="majorBidi" w:eastAsiaTheme="majorEastAsia" w:hAnsiTheme="majorHAnsi"/>
-      <w:color w:themeColor="accent1" w:themeShade="BF" w:val="0F4761"/>
-      <w:sz w:val="32"/>
-      <w:szCs w:val="32"/>
-    </w:rPr>
-  </w:style>
-  <w:style w:styleId="Heading3" w:type="paragraph">
-    <w:name w:val="heading 3"/>
-    <w:basedOn w:val="Normal"/>
-    <w:next w:val="BodyText"/>
-    <w:link w:val="Heading3Char"/>
-    <w:uiPriority w:val="9"/>
-    <w:semiHidden/>
-    <w:unhideWhenUsed/>
-    <w:qFormat/>
-    <w:rsid w:val="00A10FD9"/>
-    <w:pPr>
-      <w:keepNext/>
-      <w:keepLines/>
-      <w:spacing w:after="80" w:before="160"/>
-      <w:outlineLvl w:val="2"/>
-    </w:pPr>
-    <w:rPr>
-      <w:rFonts w:cstheme="majorBidi" w:eastAsiaTheme="majorEastAsia"/>
-      <w:color w:themeColor="accent1" w:themeShade="BF" w:val="0F4761"/>
-      <w:sz w:val="28"/>
-      <w:szCs w:val="28"/>
-    </w:rPr>
-  </w:style>
-  <w:style w:styleId="Heading4" w:type="paragraph">
-    <w:name w:val="heading 4"/>
-    <w:basedOn w:val="Normal"/>
-    <w:next w:val="BodyText"/>
-    <w:link w:val="Heading4Char"/>
-    <w:uiPriority w:val="9"/>
-    <w:semiHidden/>
-    <w:unhideWhenUsed/>
-    <w:qFormat/>
-    <w:rsid w:val="00A10FD9"/>
-    <w:pPr>
-      <w:keepNext/>
-      <w:keepLines/>
-      <w:spacing w:after="40" w:before="80"/>
-      <w:outlineLvl w:val="3"/>
-    </w:pPr>
-    <w:rPr>
-      <w:rFonts w:cstheme="majorBidi" w:eastAsiaTheme="majorEastAsia"/>
-      <w:i/>
-      <w:iCs/>
-      <w:color w:themeColor="accent1" w:themeShade="BF" w:val="0F4761"/>
-    </w:rPr>
-  </w:style>
-  <w:style w:styleId="Heading5" w:type="paragraph">
-    <w:name w:val="heading 5"/>
-    <w:basedOn w:val="Normal"/>
-    <w:next w:val="BodyText"/>
-    <w:link w:val="Heading5Char"/>
-    <w:uiPriority w:val="9"/>
-    <w:semiHidden/>
-    <w:unhideWhenUsed/>
-    <w:qFormat/>
-    <w:rsid w:val="00A10FD9"/>
-    <w:pPr>
-      <w:keepNext/>
-      <w:keepLines/>
-      <w:spacing w:after="40" w:before="80"/>
-      <w:outlineLvl w:val="4"/>
-    </w:pPr>
-    <w:rPr>
-      <w:rFonts w:cstheme="majorBidi" w:eastAsiaTheme="majorEastAsia"/>
-      <w:color w:themeColor="accent1" w:themeShade="BF" w:val="0F4761"/>
-    </w:rPr>
-  </w:style>
-  <w:style w:styleId="Heading6" w:type="paragraph">
-    <w:name w:val="heading 6"/>
-    <w:basedOn w:val="Normal"/>
-    <w:next w:val="BodyText"/>
-    <w:link w:val="Heading6Char"/>
-    <w:uiPriority w:val="9"/>
-    <w:semiHidden/>
-    <w:unhideWhenUsed/>
-    <w:qFormat/>
-    <w:rsid w:val="00A10FD9"/>
-    <w:pPr>
-      <w:keepNext/>
-      <w:keepLines/>
-      <w:spacing w:after="0" w:before="40"/>
-      <w:outlineLvl w:val="5"/>
-    </w:pPr>
-    <w:rPr>
-      <w:rFonts w:cstheme="majorBidi" w:eastAsiaTheme="majorEastAsia"/>
-      <w:i/>
-      <w:iCs/>
-      <w:color w:themeColor="text1" w:themeTint="A6" w:val="595959"/>
-    </w:rPr>
-  </w:style>
-  <w:style w:styleId="Heading7" w:type="paragraph">
-    <w:name w:val="heading 7"/>
-    <w:basedOn w:val="Normal"/>
-    <w:next w:val="BodyText"/>
-    <w:link w:val="Heading7Char"/>
-    <w:uiPriority w:val="9"/>
-    <w:semiHidden/>
-    <w:unhideWhenUsed/>
-    <w:qFormat/>
-    <w:rsid w:val="00A10FD9"/>
-    <w:pPr>
-      <w:keepNext/>
-      <w:keepLines/>
-      <w:spacing w:after="0" w:before="40"/>
-      <w:outlineLvl w:val="6"/>
-    </w:pPr>
-    <w:rPr>
-      <w:rFonts w:cstheme="majorBidi" w:eastAsiaTheme="majorEastAsia"/>
-      <w:color w:themeColor="text1" w:themeTint="A6" w:val="595959"/>
-    </w:rPr>
-  </w:style>
-  <w:style w:styleId="Heading8" w:type="paragraph">
-    <w:name w:val="heading 8"/>
-    <w:basedOn w:val="Normal"/>
-    <w:next w:val="BodyText"/>
-    <w:link w:val="Heading8Char"/>
-    <w:uiPriority w:val="9"/>
-    <w:semiHidden/>
-    <w:unhideWhenUsed/>
-    <w:qFormat/>
-    <w:rsid w:val="00A10FD9"/>
-    <w:pPr>
-      <w:keepNext/>
-      <w:keepLines/>
-      <w:spacing w:after="0"/>
-      <w:outlineLvl w:val="7"/>
-    </w:pPr>
-    <w:rPr>
-      <w:rFonts w:cstheme="majorBidi" w:eastAsiaTheme="majorEastAsia"/>
-      <w:i/>
-      <w:iCs/>
-      <w:color w:themeColor="text1" w:themeTint="D8" w:val="272727"/>
-    </w:rPr>
-  </w:style>
-  <w:style w:styleId="Heading9" w:type="paragraph">
-    <w:name w:val="heading 9"/>
-    <w:basedOn w:val="Normal"/>
-    <w:next w:val="BodyText"/>
-    <w:link w:val="Heading9Char"/>
-    <w:uiPriority w:val="9"/>
-    <w:semiHidden/>
-    <w:unhideWhenUsed/>
-    <w:qFormat/>
-    <w:rsid w:val="00A10FD9"/>
-    <w:pPr>
-      <w:keepNext/>
-      <w:keepLines/>
-      <w:spacing w:after="0"/>
-      <w:outlineLvl w:val="8"/>
-    </w:pPr>
-    <w:rPr>
-      <w:rFonts w:cstheme="majorBidi" w:eastAsiaTheme="majorEastAsia"/>
-      <w:color w:themeColor="text1" w:themeTint="D8" w:val="272727"/>
-    </w:rPr>
-  </w:style>
-  <w:style w:customStyle="1" w:styleId="Heading1Char" w:type="character">
-    <w:name w:val="Heading 1 Char"/>
-    <w:basedOn w:val="DefaultParagraphFont"/>
-    <w:link w:val="Heading1"/>
-    <w:uiPriority w:val="9"/>
-    <w:rsid w:val="00A10FD9"/>
-    <w:rPr>
-      <w:rFonts w:asciiTheme="majorHAnsi" w:cstheme="majorBidi" w:eastAsiaTheme="majorEastAsia" w:hAnsiTheme="majorHAnsi"/>
-      <w:color w:themeColor="accent1" w:themeShade="BF" w:val="0F4761"/>
-      <w:sz w:val="40"/>
-      <w:szCs w:val="40"/>
-    </w:rPr>
-  </w:style>
-  <w:style w:customStyle="1" w:styleId="Heading2Char" w:type="character">
-    <w:name w:val="Heading 2 Char"/>
-    <w:basedOn w:val="DefaultParagraphFont"/>
-    <w:link w:val="Heading2"/>
-    <w:uiPriority w:val="9"/>
-    <w:semiHidden/>
-    <w:rsid w:val="00A10FD9"/>
-    <w:rPr>
-      <w:rFonts w:asciiTheme="majorHAnsi" w:cstheme="majorBidi" w:eastAsiaTheme="majorEastAsia" w:hAnsiTheme="majorHAnsi"/>
-      <w:color w:themeColor="accent1" w:themeShade="BF" w:val="0F4761"/>
-      <w:sz w:val="32"/>
-      <w:szCs w:val="32"/>
-    </w:rPr>
-  </w:style>
-  <w:style w:customStyle="1" w:styleId="Heading3Char" w:type="character">
-    <w:name w:val="Heading 3 Char"/>
-    <w:basedOn w:val="DefaultParagraphFont"/>
-    <w:link w:val="Heading3"/>
-    <w:uiPriority w:val="9"/>
-    <w:semiHidden/>
-    <w:rsid w:val="00A10FD9"/>
-    <w:rPr>
-      <w:rFonts w:cstheme="majorBidi" w:eastAsiaTheme="majorEastAsia"/>
-      <w:color w:themeColor="accent1" w:themeShade="BF" w:val="0F4761"/>
-      <w:sz w:val="28"/>
-      <w:szCs w:val="28"/>
-    </w:rPr>
-  </w:style>
-  <w:style w:customStyle="1" w:styleId="Heading4Char" w:type="character">
-    <w:name w:val="Heading 4 Char"/>
-    <w:basedOn w:val="DefaultParagraphFont"/>
-    <w:link w:val="Heading4"/>
-    <w:uiPriority w:val="9"/>
-    <w:semiHidden/>
-    <w:rsid w:val="00A10FD9"/>
-    <w:rPr>
-      <w:rFonts w:cstheme="majorBidi" w:eastAsiaTheme="majorEastAsia"/>
-      <w:i/>
-      <w:iCs/>
-      <w:color w:themeColor="accent1" w:themeShade="BF" w:val="0F4761"/>
-    </w:rPr>
-  </w:style>
-  <w:style w:customStyle="1" w:styleId="Heading5Char" w:type="character">
-    <w:name w:val="Heading 5 Char"/>
-    <w:basedOn w:val="DefaultParagraphFont"/>
-    <w:link w:val="Heading5"/>
-    <w:uiPriority w:val="9"/>
-    <w:semiHidden/>
-    <w:rsid w:val="00A10FD9"/>
-    <w:rPr>
-      <w:rFonts w:cstheme="majorBidi" w:eastAsiaTheme="majorEastAsia"/>
-      <w:color w:themeColor="accent1" w:themeShade="BF" w:val="0F4761"/>
-    </w:rPr>
-  </w:style>
-  <w:style w:customStyle="1" w:styleId="Heading6Char" w:type="character">
-    <w:name w:val="Heading 6 Char"/>
-    <w:basedOn w:val="DefaultParagraphFont"/>
-    <w:link w:val="Heading6"/>
-    <w:uiPriority w:val="9"/>
-    <w:semiHidden/>
-    <w:rsid w:val="00A10FD9"/>
-    <w:rPr>
-      <w:rFonts w:cstheme="majorBidi" w:eastAsiaTheme="majorEastAsia"/>
-      <w:i/>
-      <w:iCs/>
-      <w:color w:themeColor="text1" w:themeTint="A6" w:val="595959"/>
-    </w:rPr>
-  </w:style>
-  <w:style w:customStyle="1" w:styleId="Heading7Char" w:type="character">
-    <w:name w:val="Heading 7 Char"/>
-    <w:basedOn w:val="DefaultParagraphFont"/>
-    <w:link w:val="Heading7"/>
-    <w:uiPriority w:val="9"/>
-    <w:semiHidden/>
-    <w:rsid w:val="00A10FD9"/>
-    <w:rPr>
-      <w:rFonts w:cstheme="majorBidi" w:eastAsiaTheme="majorEastAsia"/>
-      <w:color w:themeColor="text1" w:themeTint="A6" w:val="595959"/>
-    </w:rPr>
-  </w:style>
-  <w:style w:customStyle="1" w:styleId="Heading8Char" w:type="character">
-    <w:name w:val="Heading 8 Char"/>
-    <w:basedOn w:val="DefaultParagraphFont"/>
-    <w:link w:val="Heading8"/>
-    <w:uiPriority w:val="9"/>
-    <w:semiHidden/>
-    <w:rsid w:val="00A10FD9"/>
-    <w:rPr>
-      <w:rFonts w:cstheme="majorBidi" w:eastAsiaTheme="majorEastAsia"/>
-      <w:i/>
-      <w:iCs/>
-      <w:color w:themeColor="text1" w:themeTint="D8" w:val="272727"/>
-    </w:rPr>
-  </w:style>
-  <w:style w:customStyle="1" w:styleId="Heading9Char" w:type="character">
-    <w:name w:val="Heading 9 Char"/>
-    <w:basedOn w:val="DefaultParagraphFont"/>
-    <w:link w:val="Heading9"/>
-    <w:uiPriority w:val="9"/>
-    <w:semiHidden/>
-    <w:rsid w:val="00A10FD9"/>
-    <w:rPr>
-      <w:rFonts w:cstheme="majorBidi" w:eastAsiaTheme="majorEastAsia"/>
-      <w:color w:themeColor="text1" w:themeTint="D8" w:val="272727"/>
-    </w:rPr>
   </w:style>
   <w:style w:styleId="BlockText" w:type="paragraph">
     <w:name w:val="Block Text"/>
@@ -1404,37 +2404,18 @@
     <w:qFormat/>
     <w:pPr>
       <w:spacing w:after="100" w:before="100"/>
-      <w:ind w:firstLine="0" w:left="480" w:right="480"/>
+      <w:ind w:left="480" w:right="480"/>
     </w:pPr>
   </w:style>
   <w:style w:styleId="FootnoteText" w:type="paragraph">
-    <w:name w:val="Footnote Text"/>
+    <w:name w:val="footnote text"/>
     <w:basedOn w:val="Normal"/>
-    <w:next w:val="FootnoteText"/>
     <w:uiPriority w:val="9"/>
     <w:unhideWhenUsed/>
     <w:qFormat/>
   </w:style>
-  <w:style w:styleId="FootnoteBlockText" w:type="paragraph">
-    <w:name w:val="Footnote Block Text"/>
-    <w:basedOn w:val="FootnoteText"/>
-    <w:next w:val="FootnoteText"/>
-    <w:uiPriority w:val="9"/>
-    <w:unhideWhenUsed/>
-    <w:qFormat/>
-    <w:pPr>
-      <w:spacing w:after="100" w:before="100"/>
-      <w:ind w:firstLine="0" w:left="480" w:right="480"/>
-    </w:pPr>
-  </w:style>
-  <w:style w:default="1" w:styleId="DefaultParagraphFont" w:type="character">
-    <w:name w:val="Default Paragraph Font"/>
-    <w:semiHidden/>
-    <w:unhideWhenUsed/>
-  </w:style>
-  <w:style w:default="1" w:styleId="Table" w:type="table">
+  <w:style w:customStyle="1" w:styleId="Table" w:type="table">
     <w:name w:val="Table"/>
-    <w:basedOn w:val="TableNormal"/>
     <w:semiHidden/>
     <w:unhideWhenUsed/>
     <w:qFormat/>
@@ -1447,14 +2428,6 @@
         <w:right w:type="dxa" w:w="108"/>
       </w:tblCellMar>
     </w:tblPr>
-    <w:tblStylePr w:type="firstRow">
-      <w:tcPr>
-        <w:tcBorders>
-          <w:bottom w:val="single"/>
-        </w:tcBorders>
-        <w:vAlign w:val="bottom"/>
-      </w:tcPr>
-    </w:tblStylePr>
   </w:style>
   <w:style w:customStyle="1" w:styleId="DefinitionTerm" w:type="paragraph">
     <w:name w:val="Definition Term"/>
@@ -1474,11 +2447,11 @@
     <w:basedOn w:val="Normal"/>
   </w:style>
   <w:style w:styleId="Caption" w:type="paragraph">
-    <w:name w:val="Caption"/>
+    <w:name w:val="caption"/>
     <w:basedOn w:val="Normal"/>
-    <w:link w:val="BodyTextChar"/>
+    <w:link w:val="CaptionChar"/>
     <w:pPr>
-      <w:spacing w:after="120" w:before="0"/>
+      <w:spacing w:after="120"/>
     </w:pPr>
     <w:rPr>
       <w:i/>
@@ -1506,35 +2479,33 @@
       <w:keepNext/>
     </w:pPr>
   </w:style>
-  <w:style w:customStyle="1" w:styleId="BodyTextChar" w:type="character">
-    <w:name w:val="Body Text Char"/>
+  <w:style w:customStyle="1" w:styleId="CaptionChar" w:type="character">
+    <w:name w:val="Caption Char"/>
     <w:basedOn w:val="DefaultParagraphFont"/>
-    <w:link w:val="BodyText"/>
+    <w:link w:val="Caption"/>
   </w:style>
   <w:style w:customStyle="1" w:styleId="VerbatimChar" w:type="character">
     <w:name w:val="Verbatim Char"/>
-    <w:basedOn w:val="BodyTextChar"/>
+    <w:basedOn w:val="CaptionChar"/>
+    <w:link w:val="SourceCode"/>
     <w:rPr>
       <w:rFonts w:ascii="Consolas" w:hAnsi="Consolas"/>
       <w:sz w:val="22"/>
     </w:rPr>
   </w:style>
-  <w:style w:customStyle="1" w:styleId="SectionNumber" w:type="character">
-    <w:name w:val="Section Number"/>
-    <w:basedOn w:val="BodyTextChar"/>
-  </w:style>
   <w:style w:styleId="FootnoteReference" w:type="character">
-    <w:name w:val="Footnote Reference"/>
-    <w:basedOn w:val="BodyTextChar"/>
+    <w:name w:val="footnote reference"/>
+    <w:basedOn w:val="CaptionChar"/>
     <w:rPr>
       <w:vertAlign w:val="superscript"/>
     </w:rPr>
   </w:style>
   <w:style w:styleId="Hyperlink" w:type="character">
     <w:name w:val="Hyperlink"/>
-    <w:basedOn w:val="BodyTextChar"/>
-    <w:rPr>
-      <w:color w:themeColor="accent1" w:val="4F81BD"/>
+    <w:basedOn w:val="CaptionChar"/>
+    <w:uiPriority w:val="99"/>
+    <w:rPr>
+      <w:color w:val="E64C38"/>
     </w:rPr>
   </w:style>
   <w:style w:styleId="TOCHeading" w:type="paragraph">
@@ -1549,245 +2520,328 @@
       <w:outlineLvl w:val="9"/>
     </w:pPr>
     <w:rPr>
-      <w:rFonts w:asciiTheme="majorHAnsi" w:cstheme="majorBidi" w:eastAsiaTheme="majorEastAsia" w:hAnsiTheme="majorHAnsi"/>
       <w:b w:val="0"/>
       <w:bCs w:val="0"/>
-      <w:color w:themeColor="accent1" w:themeShade="BF" w:val="365F91"/>
-    </w:rPr>
-  </w:style>
-  <w:style w:type="paragraph" w:customStyle="1" w:styleId="SourceCode">
+    </w:rPr>
+  </w:style>
+  <w:style w:customStyle="1" w:styleId="SourceCode" w:type="paragraph">
     <w:name w:val="Source Code"/>
     <w:basedOn w:val="Normal"/>
     <w:link w:val="VerbatimChar"/>
     <w:pPr>
-      <w:wordWrap w:val="off"/>
+      <w:wordWrap w:val="0"/>
     </w:pPr>
   </w:style>
-  <w:style w:type="character" w:customStyle="1" w:styleId="KeywordTok">
+  <w:style w:customStyle="1" w:styleId="KeywordTok" w:type="character">
     <w:name w:val="KeywordTok"/>
     <w:basedOn w:val="VerbatimChar"/>
     <w:rPr>
+      <w:rFonts w:ascii="Consolas" w:hAnsi="Consolas"/>
       <w:b/>
       <w:color w:val="007020"/>
-    </w:rPr>
-  </w:style>
-  <w:style w:type="character" w:customStyle="1" w:styleId="DataTypeTok">
+      <w:sz w:val="22"/>
+    </w:rPr>
+  </w:style>
+  <w:style w:customStyle="1" w:styleId="DataTypeTok" w:type="character">
     <w:name w:val="DataTypeTok"/>
     <w:basedOn w:val="VerbatimChar"/>
     <w:rPr>
+      <w:rFonts w:ascii="Consolas" w:hAnsi="Consolas"/>
       <w:color w:val="902000"/>
-    </w:rPr>
-  </w:style>
-  <w:style w:type="character" w:customStyle="1" w:styleId="DecValTok">
+      <w:sz w:val="22"/>
+    </w:rPr>
+  </w:style>
+  <w:style w:customStyle="1" w:styleId="DecValTok" w:type="character">
     <w:name w:val="DecValTok"/>
     <w:basedOn w:val="VerbatimChar"/>
     <w:rPr>
-      <w:color w:val="40a070"/>
-    </w:rPr>
-  </w:style>
-  <w:style w:type="character" w:customStyle="1" w:styleId="BaseNTok">
+      <w:rFonts w:ascii="Consolas" w:hAnsi="Consolas"/>
+      <w:color w:val="40A070"/>
+      <w:sz w:val="22"/>
+    </w:rPr>
+  </w:style>
+  <w:style w:customStyle="1" w:styleId="BaseNTok" w:type="character">
     <w:name w:val="BaseNTok"/>
     <w:basedOn w:val="VerbatimChar"/>
     <w:rPr>
-      <w:color w:val="40a070"/>
-    </w:rPr>
-  </w:style>
-  <w:style w:type="character" w:customStyle="1" w:styleId="FloatTok">
+      <w:rFonts w:ascii="Consolas" w:hAnsi="Consolas"/>
+      <w:color w:val="40A070"/>
+      <w:sz w:val="22"/>
+    </w:rPr>
+  </w:style>
+  <w:style w:customStyle="1" w:styleId="FloatTok" w:type="character">
     <w:name w:val="FloatTok"/>
     <w:basedOn w:val="VerbatimChar"/>
     <w:rPr>
-      <w:color w:val="40a070"/>
-    </w:rPr>
-  </w:style>
-  <w:style w:type="character" w:customStyle="1" w:styleId="ConstantTok">
+      <w:rFonts w:ascii="Consolas" w:hAnsi="Consolas"/>
+      <w:color w:val="40A070"/>
+      <w:sz w:val="22"/>
+    </w:rPr>
+  </w:style>
+  <w:style w:customStyle="1" w:styleId="ConstantTok" w:type="character">
     <w:name w:val="ConstantTok"/>
     <w:basedOn w:val="VerbatimChar"/>
     <w:rPr>
+      <w:rFonts w:ascii="Consolas" w:hAnsi="Consolas"/>
       <w:color w:val="880000"/>
-    </w:rPr>
-  </w:style>
-  <w:style w:type="character" w:customStyle="1" w:styleId="CharTok">
+      <w:sz w:val="22"/>
+    </w:rPr>
+  </w:style>
+  <w:style w:customStyle="1" w:styleId="CharTok" w:type="character">
     <w:name w:val="CharTok"/>
     <w:basedOn w:val="VerbatimChar"/>
     <w:rPr>
-      <w:color w:val="4070a0"/>
-    </w:rPr>
-  </w:style>
-  <w:style w:type="character" w:customStyle="1" w:styleId="SpecialCharTok">
+      <w:rFonts w:ascii="Consolas" w:hAnsi="Consolas"/>
+      <w:color w:val="4070A0"/>
+      <w:sz w:val="22"/>
+    </w:rPr>
+  </w:style>
+  <w:style w:customStyle="1" w:styleId="SpecialCharTok" w:type="character">
     <w:name w:val="SpecialCharTok"/>
     <w:basedOn w:val="VerbatimChar"/>
     <w:rPr>
-      <w:color w:val="4070a0"/>
-    </w:rPr>
-  </w:style>
-  <w:style w:type="character" w:customStyle="1" w:styleId="StringTok">
+      <w:rFonts w:ascii="Consolas" w:hAnsi="Consolas"/>
+      <w:color w:val="4070A0"/>
+      <w:sz w:val="22"/>
+    </w:rPr>
+  </w:style>
+  <w:style w:customStyle="1" w:styleId="StringTok" w:type="character">
     <w:name w:val="StringTok"/>
     <w:basedOn w:val="VerbatimChar"/>
     <w:rPr>
-      <w:color w:val="4070a0"/>
-    </w:rPr>
-  </w:style>
-  <w:style w:type="character" w:customStyle="1" w:styleId="VerbatimStringTok">
+      <w:rFonts w:ascii="Consolas" w:hAnsi="Consolas"/>
+      <w:color w:val="4070A0"/>
+      <w:sz w:val="22"/>
+    </w:rPr>
+  </w:style>
+  <w:style w:customStyle="1" w:styleId="VerbatimStringTok" w:type="character">
     <w:name w:val="VerbatimStringTok"/>
     <w:basedOn w:val="VerbatimChar"/>
     <w:rPr>
-      <w:color w:val="4070a0"/>
-    </w:rPr>
-  </w:style>
-  <w:style w:type="character" w:customStyle="1" w:styleId="SpecialStringTok">
+      <w:rFonts w:ascii="Consolas" w:hAnsi="Consolas"/>
+      <w:color w:val="4070A0"/>
+      <w:sz w:val="22"/>
+    </w:rPr>
+  </w:style>
+  <w:style w:customStyle="1" w:styleId="SpecialStringTok" w:type="character">
     <w:name w:val="SpecialStringTok"/>
     <w:basedOn w:val="VerbatimChar"/>
     <w:rPr>
-      <w:color w:val="bb6688"/>
-    </w:rPr>
-  </w:style>
-  <w:style w:type="character" w:customStyle="1" w:styleId="ImportTok">
+      <w:rFonts w:ascii="Consolas" w:hAnsi="Consolas"/>
+      <w:color w:val="BB6688"/>
+      <w:sz w:val="22"/>
+    </w:rPr>
+  </w:style>
+  <w:style w:customStyle="1" w:styleId="ImportTok" w:type="character">
     <w:name w:val="ImportTok"/>
     <w:basedOn w:val="VerbatimChar"/>
     <w:rPr>
-      <w:b/>
-      <w:color w:val="008000"/>
-    </w:rPr>
-  </w:style>
-  <w:style w:type="character" w:customStyle="1" w:styleId="CommentTok">
+      <w:rFonts w:ascii="Consolas" w:hAnsi="Consolas"/>
+      <w:sz w:val="22"/>
+    </w:rPr>
+  </w:style>
+  <w:style w:customStyle="1" w:styleId="CommentTok" w:type="character">
     <w:name w:val="CommentTok"/>
     <w:basedOn w:val="VerbatimChar"/>
     <w:rPr>
+      <w:rFonts w:ascii="Consolas" w:hAnsi="Consolas"/>
       <w:i/>
-      <w:color w:val="60a0b0"/>
-    </w:rPr>
-  </w:style>
-  <w:style w:type="character" w:customStyle="1" w:styleId="DocumentationTok">
+      <w:color w:val="60A0B0"/>
+      <w:sz w:val="22"/>
+    </w:rPr>
+  </w:style>
+  <w:style w:customStyle="1" w:styleId="DocumentationTok" w:type="character">
     <w:name w:val="DocumentationTok"/>
     <w:basedOn w:val="VerbatimChar"/>
     <w:rPr>
+      <w:rFonts w:ascii="Consolas" w:hAnsi="Consolas"/>
       <w:i/>
-      <w:color w:val="ba2121"/>
-    </w:rPr>
-  </w:style>
-  <w:style w:type="character" w:customStyle="1" w:styleId="AnnotationTok">
+      <w:color w:val="BA2121"/>
+      <w:sz w:val="22"/>
+    </w:rPr>
+  </w:style>
+  <w:style w:customStyle="1" w:styleId="AnnotationTok" w:type="character">
     <w:name w:val="AnnotationTok"/>
     <w:basedOn w:val="VerbatimChar"/>
     <w:rPr>
+      <w:rFonts w:ascii="Consolas" w:hAnsi="Consolas"/>
       <w:b/>
       <w:i/>
-      <w:color w:val="60a0b0"/>
-    </w:rPr>
-  </w:style>
-  <w:style w:type="character" w:customStyle="1" w:styleId="CommentVarTok">
+      <w:color w:val="60A0B0"/>
+      <w:sz w:val="22"/>
+    </w:rPr>
+  </w:style>
+  <w:style w:customStyle="1" w:styleId="CommentVarTok" w:type="character">
     <w:name w:val="CommentVarTok"/>
     <w:basedOn w:val="VerbatimChar"/>
     <w:rPr>
+      <w:rFonts w:ascii="Consolas" w:hAnsi="Consolas"/>
       <w:b/>
       <w:i/>
-      <w:color w:val="60a0b0"/>
-    </w:rPr>
-  </w:style>
-  <w:style w:type="character" w:customStyle="1" w:styleId="OtherTok">
+      <w:color w:val="60A0B0"/>
+      <w:sz w:val="22"/>
+    </w:rPr>
+  </w:style>
+  <w:style w:customStyle="1" w:styleId="OtherTok" w:type="character">
     <w:name w:val="OtherTok"/>
     <w:basedOn w:val="VerbatimChar"/>
     <w:rPr>
+      <w:rFonts w:ascii="Consolas" w:hAnsi="Consolas"/>
       <w:color w:val="007020"/>
-    </w:rPr>
-  </w:style>
-  <w:style w:type="character" w:customStyle="1" w:styleId="FunctionTok">
+      <w:sz w:val="22"/>
+    </w:rPr>
+  </w:style>
+  <w:style w:customStyle="1" w:styleId="FunctionTok" w:type="character">
     <w:name w:val="FunctionTok"/>
     <w:basedOn w:val="VerbatimChar"/>
     <w:rPr>
-      <w:color w:val="06287e"/>
-    </w:rPr>
-  </w:style>
-  <w:style w:type="character" w:customStyle="1" w:styleId="VariableTok">
+      <w:rFonts w:ascii="Consolas" w:hAnsi="Consolas"/>
+      <w:color w:val="06287E"/>
+      <w:sz w:val="22"/>
+    </w:rPr>
+  </w:style>
+  <w:style w:customStyle="1" w:styleId="VariableTok" w:type="character">
     <w:name w:val="VariableTok"/>
     <w:basedOn w:val="VerbatimChar"/>
     <w:rPr>
-      <w:color w:val="19177c"/>
-    </w:rPr>
-  </w:style>
-  <w:style w:type="character" w:customStyle="1" w:styleId="ControlFlowTok">
+      <w:rFonts w:ascii="Consolas" w:hAnsi="Consolas"/>
+      <w:color w:val="19177C"/>
+      <w:sz w:val="22"/>
+    </w:rPr>
+  </w:style>
+  <w:style w:customStyle="1" w:styleId="ControlFlowTok" w:type="character">
     <w:name w:val="ControlFlowTok"/>
     <w:basedOn w:val="VerbatimChar"/>
     <w:rPr>
+      <w:rFonts w:ascii="Consolas" w:hAnsi="Consolas"/>
       <w:b/>
       <w:color w:val="007020"/>
-    </w:rPr>
-  </w:style>
-  <w:style w:type="character" w:customStyle="1" w:styleId="OperatorTok">
+      <w:sz w:val="22"/>
+    </w:rPr>
+  </w:style>
+  <w:style w:customStyle="1" w:styleId="OperatorTok" w:type="character">
     <w:name w:val="OperatorTok"/>
     <w:basedOn w:val="VerbatimChar"/>
     <w:rPr>
+      <w:rFonts w:ascii="Consolas" w:hAnsi="Consolas"/>
       <w:color w:val="666666"/>
-    </w:rPr>
-  </w:style>
-  <w:style w:type="character" w:customStyle="1" w:styleId="BuiltInTok">
+      <w:sz w:val="22"/>
+    </w:rPr>
+  </w:style>
+  <w:style w:customStyle="1" w:styleId="BuiltInTok" w:type="character">
     <w:name w:val="BuiltInTok"/>
     <w:basedOn w:val="VerbatimChar"/>
     <w:rPr>
-      <w:color w:val="008000"/>
-    </w:rPr>
-  </w:style>
-  <w:style w:type="character" w:customStyle="1" w:styleId="ExtensionTok">
+      <w:rFonts w:ascii="Consolas" w:hAnsi="Consolas"/>
+      <w:sz w:val="22"/>
+    </w:rPr>
+  </w:style>
+  <w:style w:customStyle="1" w:styleId="ExtensionTok" w:type="character">
     <w:name w:val="ExtensionTok"/>
     <w:basedOn w:val="VerbatimChar"/>
-    <w:rPr/>
-  </w:style>
-  <w:style w:type="character" w:customStyle="1" w:styleId="PreprocessorTok">
+    <w:rPr>
+      <w:rFonts w:ascii="Consolas" w:hAnsi="Consolas"/>
+      <w:sz w:val="22"/>
+    </w:rPr>
+  </w:style>
+  <w:style w:customStyle="1" w:styleId="PreprocessorTok" w:type="character">
     <w:name w:val="PreprocessorTok"/>
     <w:basedOn w:val="VerbatimChar"/>
     <w:rPr>
-      <w:color w:val="bc7a00"/>
-    </w:rPr>
-  </w:style>
-  <w:style w:type="character" w:customStyle="1" w:styleId="AttributeTok">
+      <w:rFonts w:ascii="Consolas" w:hAnsi="Consolas"/>
+      <w:color w:val="BC7A00"/>
+      <w:sz w:val="22"/>
+    </w:rPr>
+  </w:style>
+  <w:style w:customStyle="1" w:styleId="AttributeTok" w:type="character">
     <w:name w:val="AttributeTok"/>
     <w:basedOn w:val="VerbatimChar"/>
     <w:rPr>
-      <w:color w:val="7d9029"/>
-    </w:rPr>
-  </w:style>
-  <w:style w:type="character" w:customStyle="1" w:styleId="RegionMarkerTok">
+      <w:rFonts w:ascii="Consolas" w:hAnsi="Consolas"/>
+      <w:color w:val="7D9029"/>
+      <w:sz w:val="22"/>
+    </w:rPr>
+  </w:style>
+  <w:style w:customStyle="1" w:styleId="RegionMarkerTok" w:type="character">
     <w:name w:val="RegionMarkerTok"/>
     <w:basedOn w:val="VerbatimChar"/>
-    <w:rPr/>
-  </w:style>
-  <w:style w:type="character" w:customStyle="1" w:styleId="InformationTok">
+    <w:rPr>
+      <w:rFonts w:ascii="Consolas" w:hAnsi="Consolas"/>
+      <w:sz w:val="22"/>
+    </w:rPr>
+  </w:style>
+  <w:style w:customStyle="1" w:styleId="InformationTok" w:type="character">
     <w:name w:val="InformationTok"/>
     <w:basedOn w:val="VerbatimChar"/>
     <w:rPr>
+      <w:rFonts w:ascii="Consolas" w:hAnsi="Consolas"/>
       <w:b/>
       <w:i/>
-      <w:color w:val="60a0b0"/>
-    </w:rPr>
-  </w:style>
-  <w:style w:type="character" w:customStyle="1" w:styleId="WarningTok">
+      <w:color w:val="60A0B0"/>
+      <w:sz w:val="22"/>
+    </w:rPr>
+  </w:style>
+  <w:style w:customStyle="1" w:styleId="WarningTok" w:type="character">
     <w:name w:val="WarningTok"/>
     <w:basedOn w:val="VerbatimChar"/>
     <w:rPr>
+      <w:rFonts w:ascii="Consolas" w:hAnsi="Consolas"/>
       <w:b/>
       <w:i/>
-      <w:color w:val="60a0b0"/>
-    </w:rPr>
-  </w:style>
-  <w:style w:type="character" w:customStyle="1" w:styleId="AlertTok">
+      <w:color w:val="60A0B0"/>
+      <w:sz w:val="22"/>
+    </w:rPr>
+  </w:style>
+  <w:style w:customStyle="1" w:styleId="AlertTok" w:type="character">
     <w:name w:val="AlertTok"/>
     <w:basedOn w:val="VerbatimChar"/>
     <w:rPr>
+      <w:rFonts w:ascii="Consolas" w:hAnsi="Consolas"/>
       <w:b/>
-      <w:color w:val="ff0000"/>
-    </w:rPr>
-  </w:style>
-  <w:style w:type="character" w:customStyle="1" w:styleId="ErrorTok">
+      <w:color w:val="FF0000"/>
+      <w:sz w:val="22"/>
+    </w:rPr>
+  </w:style>
+  <w:style w:customStyle="1" w:styleId="ErrorTok" w:type="character">
     <w:name w:val="ErrorTok"/>
     <w:basedOn w:val="VerbatimChar"/>
     <w:rPr>
+      <w:rFonts w:ascii="Consolas" w:hAnsi="Consolas"/>
       <w:b/>
-      <w:color w:val="ff0000"/>
-    </w:rPr>
-  </w:style>
-  <w:style w:type="character" w:customStyle="1" w:styleId="NormalTok">
+      <w:color w:val="FF0000"/>
+      <w:sz w:val="22"/>
+    </w:rPr>
+  </w:style>
+  <w:style w:customStyle="1" w:styleId="NormalTok" w:type="character">
     <w:name w:val="NormalTok"/>
     <w:basedOn w:val="VerbatimChar"/>
-    <w:rPr/>
+    <w:rPr>
+      <w:rFonts w:ascii="Consolas" w:hAnsi="Consolas"/>
+      <w:sz w:val="22"/>
+    </w:rPr>
+  </w:style>
+  <w:style w:styleId="TOC1" w:type="paragraph">
+    <w:name w:val="toc 1"/>
+    <w:basedOn w:val="Normal"/>
+    <w:next w:val="Normal"/>
+    <w:autoRedefine/>
+    <w:uiPriority w:val="39"/>
+    <w:rsid w:val="005704A3"/>
+    <w:pPr>
+      <w:spacing w:after="100"/>
+    </w:pPr>
+  </w:style>
+  <w:style w:styleId="TOC2" w:type="paragraph">
+    <w:name w:val="toc 2"/>
+    <w:basedOn w:val="Normal"/>
+    <w:next w:val="Normal"/>
+    <w:autoRedefine/>
+    <w:uiPriority w:val="39"/>
+    <w:rsid w:val="005704A3"/>
+    <w:pPr>
+      <w:spacing w:after="100"/>
+      <w:ind w:left="220"/>
+    </w:pPr>
   </w:style>
 </w:styles>
 </file>
@@ -1803,44 +2857,44 @@
         <a:sysClr val="window" lastClr="FFFFFF"/>
       </a:lt1>
       <a:dk2>
-        <a:srgbClr val="0E2841"/>
+        <a:srgbClr val="1F497D"/>
       </a:dk2>
       <a:lt2>
-        <a:srgbClr val="E8E8E8"/>
+        <a:srgbClr val="EEECE1"/>
       </a:lt2>
       <a:accent1>
-        <a:srgbClr val="156082"/>
+        <a:srgbClr val="4F81BD"/>
       </a:accent1>
       <a:accent2>
-        <a:srgbClr val="E97132"/>
+        <a:srgbClr val="C0504D"/>
       </a:accent2>
       <a:accent3>
-        <a:srgbClr val="196B24"/>
+        <a:srgbClr val="9BBB59"/>
       </a:accent3>
       <a:accent4>
-        <a:srgbClr val="0F9ED5"/>
+        <a:srgbClr val="8064A2"/>
       </a:accent4>
       <a:accent5>
-        <a:srgbClr val="A02B93"/>
+        <a:srgbClr val="4BACC6"/>
       </a:accent5>
       <a:accent6>
-        <a:srgbClr val="4EA72E"/>
+        <a:srgbClr val="F79646"/>
       </a:accent6>
       <a:hlink>
-        <a:srgbClr val="467886"/>
+        <a:srgbClr val="0000FF"/>
       </a:hlink>
       <a:folHlink>
-        <a:srgbClr val="96607D"/>
+        <a:srgbClr val="800080"/>
       </a:folHlink>
     </a:clrScheme>
     <a:fontScheme name="Office">
       <a:majorFont>
-        <a:latin typeface="Aptos Display" panose="02110004020202020204"/>
+        <a:latin typeface="Montserrat"/>
         <a:ea typeface=""/>
         <a:cs typeface=""/>
-        <a:font script="Jpan" typeface="游ゴシック Light"/>
+        <a:font script="Jpan" typeface="ＭＳ ゴシック"/>
         <a:font script="Hang" typeface="맑은 고딕"/>
-        <a:font script="Hans" typeface="等线 Light"/>
+        <a:font script="Hans" typeface="宋体"/>
         <a:font script="Hant" typeface="新細明體"/>
         <a:font script="Arab" typeface="Times New Roman"/>
         <a:font script="Hebr" typeface="Times New Roman"/>
@@ -1867,32 +2921,14 @@
         <a:font script="Mong" typeface="Mongolian Baiti"/>
         <a:font script="Viet" typeface="Times New Roman"/>
         <a:font script="Uigh" typeface="Microsoft Uighur"/>
-        <a:font script="Geor" typeface="Sylfaen"/>
-        <a:font script="Armn" typeface="Arial"/>
-        <a:font script="Bugi" typeface="Leelawadee UI"/>
-        <a:font script="Bopo" typeface="Microsoft JhengHei"/>
-        <a:font script="Java" typeface="Javanese Text"/>
-        <a:font script="Lisu" typeface="Segoe UI"/>
-        <a:font script="Mymr" typeface="Myanmar Text"/>
-        <a:font script="Nkoo" typeface="Ebrima"/>
-        <a:font script="Olck" typeface="Nirmala UI"/>
-        <a:font script="Osma" typeface="Ebrima"/>
-        <a:font script="Phag" typeface="Phagspa"/>
-        <a:font script="Syrn" typeface="Estrangelo Edessa"/>
-        <a:font script="Syrj" typeface="Estrangelo Edessa"/>
-        <a:font script="Syre" typeface="Estrangelo Edessa"/>
-        <a:font script="Sora" typeface="Nirmala UI"/>
-        <a:font script="Tale" typeface="Microsoft Tai Le"/>
-        <a:font script="Talu" typeface="Microsoft New Tai Lue"/>
-        <a:font script="Tfng" typeface="Ebrima"/>
       </a:majorFont>
       <a:minorFont>
-        <a:latin typeface="Aptos" panose="02110004020202020204"/>
+        <a:latin typeface="Montserrat"/>
         <a:ea typeface=""/>
         <a:cs typeface=""/>
-        <a:font script="Jpan" typeface="游明朝"/>
+        <a:font script="Jpan" typeface="ＭＳ 明朝"/>
         <a:font script="Hang" typeface="맑은 고딕"/>
-        <a:font script="Hans" typeface="等线"/>
+        <a:font script="Hans" typeface="宋体"/>
         <a:font script="Hant" typeface="新細明體"/>
         <a:font script="Arab" typeface="Arial"/>
         <a:font script="Hebr" typeface="Arial"/>
@@ -1919,24 +2955,6 @@
         <a:font script="Mong" typeface="Mongolian Baiti"/>
         <a:font script="Viet" typeface="Arial"/>
         <a:font script="Uigh" typeface="Microsoft Uighur"/>
-        <a:font script="Geor" typeface="Sylfaen"/>
-        <a:font script="Armn" typeface="Arial"/>
-        <a:font script="Bugi" typeface="Leelawadee UI"/>
-        <a:font script="Bopo" typeface="Microsoft JhengHei"/>
-        <a:font script="Java" typeface="Javanese Text"/>
-        <a:font script="Lisu" typeface="Segoe UI"/>
-        <a:font script="Mymr" typeface="Myanmar Text"/>
-        <a:font script="Nkoo" typeface="Ebrima"/>
-        <a:font script="Olck" typeface="Nirmala UI"/>
-        <a:font script="Osma" typeface="Ebrima"/>
-        <a:font script="Phag" typeface="Phagspa"/>
-        <a:font script="Syrn" typeface="Estrangelo Edessa"/>
-        <a:font script="Syrj" typeface="Estrangelo Edessa"/>
-        <a:font script="Syre" typeface="Estrangelo Edessa"/>
-        <a:font script="Sora" typeface="Nirmala UI"/>
-        <a:font script="Tale" typeface="Microsoft Tai Le"/>
-        <a:font script="Talu" typeface="Microsoft New Tai Lue"/>
-        <a:font script="Tfng" typeface="Ebrima"/>
       </a:minorFont>
     </a:fontScheme>
     <a:fmtScheme name="Office">
@@ -1948,141 +2966,200 @@
           <a:gsLst>
             <a:gs pos="0">
               <a:schemeClr val="phClr">
-                <a:lumMod val="110000"/>
-                <a:satMod val="105000"/>
-                <a:tint val="67000"/>
+                <a:tint val="50000"/>
+                <a:satMod val="300000"/>
               </a:schemeClr>
             </a:gs>
-            <a:gs pos="50000">
+            <a:gs pos="35000">
               <a:schemeClr val="phClr">
-                <a:lumMod val="105000"/>
-                <a:satMod val="103000"/>
-                <a:tint val="73000"/>
+                <a:tint val="37000"/>
+                <a:satMod val="300000"/>
               </a:schemeClr>
             </a:gs>
             <a:gs pos="100000">
               <a:schemeClr val="phClr">
-                <a:lumMod val="105000"/>
-                <a:satMod val="109000"/>
-                <a:tint val="81000"/>
+                <a:tint val="15000"/>
+                <a:satMod val="350000"/>
               </a:schemeClr>
             </a:gs>
           </a:gsLst>
-          <a:lin ang="5400000" scaled="0"/>
+          <a:lin ang="16200000" scaled="1"/>
         </a:gradFill>
         <a:gradFill rotWithShape="1">
           <a:gsLst>
             <a:gs pos="0">
               <a:schemeClr val="phClr">
-                <a:satMod val="103000"/>
-                <a:lumMod val="102000"/>
-                <a:tint val="94000"/>
-              </a:schemeClr>
-            </a:gs>
-            <a:gs pos="50000">
-              <a:schemeClr val="phClr">
-                <a:satMod val="110000"/>
-                <a:lumMod val="100000"/>
+                <a:tint val="100000"/>
                 <a:shade val="100000"/>
+                <a:satMod val="130000"/>
               </a:schemeClr>
             </a:gs>
             <a:gs pos="100000">
               <a:schemeClr val="phClr">
-                <a:lumMod val="99000"/>
-                <a:satMod val="120000"/>
-                <a:shade val="78000"/>
+                <a:tint val="50000"/>
+                <a:shade val="100000"/>
+                <a:satMod val="350000"/>
               </a:schemeClr>
             </a:gs>
           </a:gsLst>
-          <a:lin ang="5400000" scaled="0"/>
+          <a:lin ang="16200000" scaled="0"/>
         </a:gradFill>
       </a:fillStyleLst>
       <a:lnStyleLst>
-        <a:ln w="6350" cap="flat" cmpd="sng" algn="ctr">
+        <a:ln w="9525" cap="flat" cmpd="sng" algn="ctr">
+          <a:solidFill>
+            <a:schemeClr val="phClr">
+              <a:shade val="95000"/>
+              <a:satMod val="105000"/>
+            </a:schemeClr>
+          </a:solidFill>
+          <a:prstDash val="solid"/>
+        </a:ln>
+        <a:ln w="25400" cap="flat" cmpd="sng" algn="ctr">
           <a:solidFill>
             <a:schemeClr val="phClr"/>
           </a:solidFill>
           <a:prstDash val="solid"/>
-          <a:miter lim="800000"/>
         </a:ln>
-        <a:ln w="12700" cap="flat" cmpd="sng" algn="ctr">
+        <a:ln w="38100" cap="flat" cmpd="sng" algn="ctr">
           <a:solidFill>
             <a:schemeClr val="phClr"/>
           </a:solidFill>
           <a:prstDash val="solid"/>
-          <a:miter lim="800000"/>
-        </a:ln>
-        <a:ln w="19050" cap="flat" cmpd="sng" algn="ctr">
-          <a:solidFill>
-            <a:schemeClr val="phClr"/>
-          </a:solidFill>
-          <a:prstDash val="solid"/>
-          <a:miter lim="800000"/>
         </a:ln>
       </a:lnStyleLst>
       <a:effectStyleLst>
         <a:effectStyle>
-          <a:effectLst/>
-        </a:effectStyle>
-        <a:effectStyle>
-          <a:effectLst/>
+          <a:effectLst>
+            <a:outerShdw blurRad="40000" dist="20000" dir="5400000" rotWithShape="0">
+              <a:srgbClr val="000000">
+                <a:alpha val="38000"/>
+              </a:srgbClr>
+            </a:outerShdw>
+          </a:effectLst>
         </a:effectStyle>
         <a:effectStyle>
           <a:effectLst>
-            <a:outerShdw blurRad="57150" dist="19050" dir="5400000" algn="ctr" rotWithShape="0">
+            <a:outerShdw blurRad="40000" dist="23000" dir="5400000" rotWithShape="0">
               <a:srgbClr val="000000">
-                <a:alpha val="63000"/>
+                <a:alpha val="35000"/>
               </a:srgbClr>
             </a:outerShdw>
           </a:effectLst>
+        </a:effectStyle>
+        <a:effectStyle>
+          <a:effectLst>
+            <a:outerShdw blurRad="40000" dist="23000" dir="5400000" rotWithShape="0">
+              <a:srgbClr val="000000">
+                <a:alpha val="35000"/>
+              </a:srgbClr>
+            </a:outerShdw>
+          </a:effectLst>
+          <a:scene3d>
+            <a:camera prst="orthographicFront">
+              <a:rot lat="0" lon="0" rev="0"/>
+            </a:camera>
+            <a:lightRig rig="threePt" dir="t">
+              <a:rot lat="0" lon="0" rev="1200000"/>
+            </a:lightRig>
+          </a:scene3d>
+          <a:sp3d>
+            <a:bevelT w="63500" h="25400"/>
+          </a:sp3d>
         </a:effectStyle>
       </a:effectStyleLst>
       <a:bgFillStyleLst>
         <a:solidFill>
           <a:schemeClr val="phClr"/>
         </a:solidFill>
-        <a:solidFill>
-          <a:schemeClr val="phClr">
-            <a:tint val="95000"/>
-            <a:satMod val="170000"/>
-          </a:schemeClr>
-        </a:solidFill>
         <a:gradFill rotWithShape="1">
           <a:gsLst>
             <a:gs pos="0">
               <a:schemeClr val="phClr">
-                <a:tint val="93000"/>
-                <a:satMod val="150000"/>
-                <a:shade val="98000"/>
-                <a:lumMod val="102000"/>
+                <a:tint val="40000"/>
+                <a:satMod val="350000"/>
               </a:schemeClr>
             </a:gs>
-            <a:gs pos="50000">
+            <a:gs pos="40000">
               <a:schemeClr val="phClr">
-                <a:tint val="98000"/>
-                <a:satMod val="130000"/>
-                <a:shade val="90000"/>
-                <a:lumMod val="103000"/>
+                <a:tint val="45000"/>
+                <a:shade val="99000"/>
+                <a:satMod val="350000"/>
               </a:schemeClr>
             </a:gs>
             <a:gs pos="100000">
               <a:schemeClr val="phClr">
-                <a:shade val="63000"/>
-                <a:satMod val="120000"/>
+                <a:shade val="20000"/>
+                <a:satMod val="255000"/>
               </a:schemeClr>
             </a:gs>
           </a:gsLst>
-          <a:lin ang="5400000" scaled="0"/>
+          <a:path path="circle">
+            <a:fillToRect l="50000" t="-80000" r="50000" b="180000"/>
+          </a:path>
+        </a:gradFill>
+        <a:gradFill rotWithShape="1">
+          <a:gsLst>
+            <a:gs pos="0">
+              <a:schemeClr val="phClr">
+                <a:tint val="80000"/>
+                <a:satMod val="300000"/>
+              </a:schemeClr>
+            </a:gs>
+            <a:gs pos="100000">
+              <a:schemeClr val="phClr">
+                <a:shade val="30000"/>
+                <a:satMod val="200000"/>
+              </a:schemeClr>
+            </a:gs>
+          </a:gsLst>
+          <a:path path="circle">
+            <a:fillToRect l="50000" t="50000" r="50000" b="50000"/>
+          </a:path>
         </a:gradFill>
       </a:bgFillStyleLst>
     </a:fmtScheme>
   </a:themeElements>
-  <a:objectDefaults/>
+  <a:objectDefaults>
+    <a:spDef>
+      <a:spPr/>
+      <a:bodyPr/>
+      <a:lstStyle/>
+      <a:style>
+        <a:lnRef idx="1">
+          <a:schemeClr val="accent1"/>
+        </a:lnRef>
+        <a:fillRef idx="3">
+          <a:schemeClr val="accent1"/>
+        </a:fillRef>
+        <a:effectRef idx="2">
+          <a:schemeClr val="accent1"/>
+        </a:effectRef>
+        <a:fontRef idx="minor">
+          <a:schemeClr val="lt1"/>
+        </a:fontRef>
+      </a:style>
+    </a:spDef>
+    <a:lnDef>
+      <a:spPr/>
+      <a:bodyPr/>
+      <a:lstStyle/>
+      <a:style>
+        <a:lnRef idx="2">
+          <a:schemeClr val="accent1"/>
+        </a:lnRef>
+        <a:fillRef idx="0">
+          <a:schemeClr val="accent1"/>
+        </a:fillRef>
+        <a:effectRef idx="1">
+          <a:schemeClr val="accent1"/>
+        </a:effectRef>
+        <a:fontRef idx="minor">
+          <a:schemeClr val="tx1"/>
+        </a:fontRef>
+      </a:style>
+    </a:lnDef>
+  </a:objectDefaults>
   <a:extraClrSchemeLst/>
-  <a:extLst>
-    <a:ext uri="{05A4C25C-085E-4340-85A3-A5531E510DB2}">
-      <thm15:themeFamily xmlns:thm15="http://schemas.microsoft.com/office/thememl/2012/main" name="Office Theme" id="{2E142A2C-CD16-42D6-873A-C26D2A0506FA}" vid="{1BDDFF52-6CD6-40A5-AB3C-68EB2F1E4D0A}"/>
-    </a:ext>
-  </a:extLst>
 </a:theme>
 </file>
</xml_diff>